<commit_message>
Second-pass review of Focus on Meditation Chinese translation
Independent re-review against the English source, chunk by chunk, on
top of the earlier translation and proofreading passes. 106 lines
changed: reversed logic and causality, a mistranslated yes/no question,
a temperament label confused with a philosophical school, a restored
'three' that the first pass had silently corrected, wishing-away
rendered as prayer, plus terminology and fluency fixes.

Book-wide unification: nature of mind -> 心性, thoughts arising ->
生起, 执着, 传承, established Chinese names for the Tibetan teachers
and Yogananda with the author's spelling on first mention.

Full change log in translation/复校记录-第二轮.md.

Co-Authored-By: Claude Opus 5.5 <noreply@anthropic.com>
Claude-Session: https://claude.ai/code/session_01RHzAWnvxVSv9kYjz6aghjY
</commit_message>
<xml_diff>
--- a/translation/Focus_on_Meditation_zh-CN.docx
+++ b/translation/Focus_on_Meditation_zh-CN.docx
@@ -162,7 +162,7 @@
         <w:rPr>
           <w:rFonts w:ascii="SimSun" w:cs="SimSun" w:eastAsia="SimSun" w:hAnsi="SimSun"/>
         </w:rPr>
-        <w:t xml:space="preserve">经文引文仅作教育用途。所有权利仍归各自的版权所有者。</w:t>
+        <w:t xml:space="preserve">经文引文系出于教育目的而使用。所有权利仍归各自的版权所有者。</w:t>
       </w:r>
     </w:p>
     <w:p>
@@ -244,7 +244,7 @@
         <w:rPr>
           <w:rFonts w:ascii="SimSun" w:cs="SimSun" w:eastAsia="SimSun" w:hAnsi="SimSun"/>
         </w:rPr>
-        <w:t xml:space="preserve">最近我读了 Bruce Barnbaum 的《摄影的艺术》，不禁眼前一亮：他书中描述的那些摄影技巧，或许可以运用到冥想上来——比起摄影，冥想是我熟悉得多的领域。我决定把这个想法付诸检验，其成果便是这本书。本书写给这样的读者：他们有意以正统意义上的方式走近冥想，并乐于透过摄影师所熟悉的语言这枚“镜头”来认识它。</w:t>
+        <w:t xml:space="preserve">最近我读了 Bruce Barnbaum 的《摄影的艺术》，不禁眼前一亮：他书中描述的那些摄影技巧，或许可以运用到冥想上来——比起摄影，冥想是我熟悉得多的领域。我决定把这个想法付诸检验，其成果便是这本书。本书写给这样的读者：他们有意走近正统意义上的冥想，并乐于透过摄影师所熟悉的语言这枚“镜头”来认识它。</w:t>
       </w:r>
     </w:p>
     <w:p>
@@ -299,7 +299,6 @@
       <w:r>
         <w:rPr>
           <w:rFonts w:ascii="SimHei" w:cs="SimHei" w:eastAsia="SimHei" w:hAnsi="SimHei"/>
-          <w:color w:val="000000"/>
           <w:sz w:val="36"/>
           <w:szCs w:val="36"/>
         </w:rPr>
@@ -457,7 +456,7 @@
         <w:rPr>
           <w:rFonts w:ascii="SimSun" w:cs="SimSun" w:eastAsia="SimSun" w:hAnsi="SimSun"/>
         </w:rPr>
-        <w:t xml:space="preserve">人们开始修习冥想，是因为渴望改变与蜕变。他们感到内心深处有某种大于自我的东西，并希望与那份伟大合一。然而，我们这些寻常人惯于事事“如我所愿”、惯于为达目的采取一切必要手段，于是总忍不住像插手日常事务那样去插手冥想的进程——麻烦正由此而生。冥想不会像日常事务那样对我们的干预作出回应。</w:t>
+        <w:t xml:space="preserve">人们开始修习冥想，是因为渴望改变与蜕变。他们感到内心深处有某种大于自我的东西，并希望与那份伟大合一。然而，我们这些寻常人惯于事事“如我所愿”、惯于为达目的采取一切必要手段，于是为这种习性所累，总忍不住像插手日常事务那样去插手冥想的进程——麻烦正由此而生。冥想不会像日常事务那样对我们的干预作出回应。</w:t>
       </w:r>
     </w:p>
     <w:p>
@@ -481,19 +480,19 @@
         <w:rPr>
           <w:rFonts w:ascii="SimSun" w:cs="SimSun" w:eastAsia="SimSun" w:hAnsi="SimSun"/>
         </w:rPr>
-        <w:t xml:space="preserve">初学冥想的人，得到的无一例外是自己不想要的东西。我们许多人背负着过去的恶业，必须先将其清理，冥想才会开始呈现出与我们最初的想象稍稍接近的样子。如果一开始我们就问问自己：“谁”想冥想？为什么想冥想？我们或许就会承认，若不先清除障碍、烦恼、过失与负面情绪，那些宏大的期待并不现实——而这些东西不会因我们的祈愿而消失，唯有审视它们、承认它们，才能化解。冥想在最初阶段会直指我们的过失；若能理解并欣然接受这一事实，我们便有可能由此踏上终身修习冥想之路。</w:t>
-      </w:r>
-    </w:p>
-    <w:p>
-      <w:pPr>
-        <w:spacing w:after="120" w:line="340"/>
-        <w:ind w:firstLine="480"/>
-      </w:pPr>
-      <w:r>
-        <w:rPr>
-          <w:rFonts w:ascii="SimSun" w:cs="SimSun" w:eastAsia="SimSun" w:hAnsi="SimSun"/>
-        </w:rPr>
-        <w:t xml:space="preserve">优秀的摄影师会去看环境在向他传达什么；蹩脚的摄影师则只想找到自己想看的东西。我们在世事中挣扎，是因为我们无休止地追逐自己能得到什么，而这个过程可能遮蔽了正在被给予我们的东西。冥想提供了一个契机，让我们有望走出对日常生活不满的困局；可有时我们又把一生养成的种种习气带进冥想，而这些习气在许多方面恰与冥想式的生活方式相抵触。</w:t>
+        <w:t xml:space="preserve">初学冥想的人，得到的无一例外是自己不想要的东西。我们许多人背负着过去的恶业，必须先将其净除，冥想才会开始呈现出与我们最初的想象稍稍接近的样子。如果一开始我们就问问自己：“谁”想冥想？为什么想冥想？我们或许就会承认，若不先清除障碍、烦恼、过失与负面情绪，那些宏大的期待并不现实——而这些东西不会因我们一厢情愿就消失，唯有审视它们、承认它们，才能化解。冥想在最初阶段会直指我们的过失；若能理解并欣然接受这一事实，我们便有可能由此踏上终身修习冥想之路。</w:t>
+      </w:r>
+    </w:p>
+    <w:p>
+      <w:pPr>
+        <w:spacing w:after="120" w:line="340"/>
+        <w:ind w:firstLine="480"/>
+      </w:pPr>
+      <w:r>
+        <w:rPr>
+          <w:rFonts w:ascii="SimSun" w:cs="SimSun" w:eastAsia="SimSun" w:hAnsi="SimSun"/>
+        </w:rPr>
+        <w:t xml:space="preserve">优秀的摄影师会去看环境在向他传达什么；蹩脚的摄影师则只想找到自己想看的东西。我们在世事中挣扎，是因为我们无休止地追逐自己能得到什么，而这个过程可能遮蔽了此刻正给予我们的东西。冥想提供了一个契机，让我们有望走出对日常生活不满的困局；可有时我们又把一生养成的种种习气带进冥想，而这些习气在许多方面恰与冥想式的生活方式相抵触。</w:t>
       </w:r>
     </w:p>
     <w:p>
@@ -517,7 +516,7 @@
         <w:rPr>
           <w:rFonts w:ascii="SimSun" w:cs="SimSun" w:eastAsia="SimSun" w:hAnsi="SimSun"/>
         </w:rPr>
-        <w:t xml:space="preserve">成功的冥想修习会带来前所未有的疑问与疑虑，引我们向内探索，却不对所见加以铺陈渲染。它是一种被动的觉知，能拓展我们的视野与思想。冥想是通过聆听与自己沟通，是对聆听这门艺术的精细调校。它不是想听到自己爱听的话，而是敞开心扉，去吸收冥想正在传达的东西。</w:t>
+        <w:t xml:space="preserve">成功的冥想修习会带来前所未有的疑问与疑虑，引我们向内探索，却不对所见加以推衍。它是一种被动的觉知，能拓展我们的视野与思想。冥想是通过聆听与自己沟通，是对聆听这门艺术的精细调校。它不是想听到自己爱听的话，而是敞开心扉，去吸收冥想正在传达的东西。</w:t>
       </w:r>
     </w:p>
     <w:p>
@@ -585,7 +584,7 @@
         <w:rPr>
           <w:rFonts w:ascii="SimSun" w:cs="SimSun" w:eastAsia="SimSun" w:hAnsi="SimSun"/>
         </w:rPr>
-        <w:t xml:space="preserve">也许我们对冥想本无多少热忱，只是姑且一试；过了一段时间，觉得步步维艰，便放弃了。遗憾的是，这种情况相当普遍，但本不该如此。冥想中感觉撞墙的原因有很多。初学者会碰到，久经修习的人也会碰到，只是初学者的问题更为突出，因为他们除了放弃想不出别的办法。有经验的修习者会意识到错在方法，转而尝试另一条进路来突破障碍。初学者往往不了解冥想技巧何等丰富多样，可能误以为自己不适合冥想。他们容易气馁，因为不知道自己其实还有许多选择。而成熟的冥想者换一种技巧不过是家常便饭，随时愿意以新的进路穿越顽固的关卡。</w:t>
+        <w:t xml:space="preserve">也许我们对冥想本无多少热忱，只是姑且一试；过了一段时间，觉得步步维艰，便放弃了。遗憾的是，这种情况相当普遍，但本不该如此。冥想中感觉撞墙的原因有很多。初学者会碰到，久经修习的人也会碰到，只是初学者的问题更为突出，因为他们除了放弃想不出别的办法。有经验的修行者会意识到错在方法，转而尝试另一条进路来突破障碍。初学者往往不了解冥想技巧何等丰富多样，可能误以为自己不适合冥想。他们容易气馁，因为不知道自己其实还有许多选择。而成熟的冥想者换一种技巧时不会多作纠结，随时愿意以新的进路穿越顽固的关卡。</w:t>
       </w:r>
     </w:p>
     <w:p>
@@ -850,19 +849,19 @@
         <w:rPr>
           <w:rFonts w:ascii="SimSun" w:cs="SimSun" w:eastAsia="SimSun" w:hAnsi="SimSun"/>
         </w:rPr>
-        <w:t xml:space="preserve">究竟是什么在驱动我们运转？这是唯一值得我们关心的事。如何找到答案？唯一的办法是让自己变成这个问题，而变成这个问题的唯一办法，是对它不停地冥想。除了这个问题，我们不应再认任何别的关系。在处理日常事务时，这个问题必须成为我们最挂心的事。纷繁至极的刺激铺天盖地而来，我们的眼与耳却把一切天衣无缝地调和为一体，嗅觉、味觉、触觉亦然——全都被组织成一个可以辨认的世界。这一切的发生，不费我们分毫之力。这一切究竟是如何发生的？</w:t>
-      </w:r>
-    </w:p>
-    <w:p>
-      <w:pPr>
-        <w:spacing w:after="120" w:line="340"/>
-        <w:ind w:firstLine="480"/>
-      </w:pPr>
-      <w:r>
-        <w:rPr>
-          <w:rFonts w:ascii="SimSun" w:cs="SimSun" w:eastAsia="SimSun" w:hAnsi="SimSun"/>
-        </w:rPr>
-        <w:t xml:space="preserve">明媚的晴日会影响我们的心情，灰暗的阴天同样如此。寒气袭来，我们蜷起四肢；暑热逼人，我们摊开身体散热。天气可以唤起乐观，也可以唤起悲观，我们却可能浑然不觉，也想不到把情绪归因于变幻不定的气候。外部影响会唤起内在的心绪倾向，无论那影响是环境与季节更替这样的自然现象，还是工作、家庭、健康等境遇的变迁。那么，这一切变化又是以什么为前提的呢？</w:t>
+        <w:t xml:space="preserve">究竟是什么在驱动我们运转？这是唯一值得我们关心的事。如何找到答案？唯一的办法是让自己变成这个问题，而变成这个问题的唯一办法，是对它不停地冥想。除了与这个问题的关系，我们不可再有任何别的关系。在处理日常事务时，这个问题必须成为我们最挂心的事。纷繁至极的刺激铺天盖地而来，我们的眼与耳却把一切天衣无缝地调和为一体，嗅觉、味觉、触觉亦然——全都被组织成一个可以辨认的世界。这一切的发生，不费我们分毫之力。这一切究竟是如何发生的？</w:t>
+      </w:r>
+    </w:p>
+    <w:p>
+      <w:pPr>
+        <w:spacing w:after="120" w:line="340"/>
+        <w:ind w:firstLine="480"/>
+      </w:pPr>
+      <w:r>
+        <w:rPr>
+          <w:rFonts w:ascii="SimSun" w:cs="SimSun" w:eastAsia="SimSun" w:hAnsi="SimSun"/>
+        </w:rPr>
+        <w:t xml:space="preserve">明媚的晴日会影响我们的心境，灰暗的阴天同样如此。寒气袭来，我们蜷起四肢；暑热逼人，我们摊开身体散热。天气可以唤起乐观，也可以唤起悲观，我们却可能浑然不觉，也想不到把自己的心境归因于变幻不定的气候。外部影响会唤起内在的心绪倾向，无论那影响是环境与季节更替这样的自然现象，还是工作、家庭、健康等境遇的变迁。那么，这一切变化又是以什么为前提的呢？</w:t>
       </w:r>
     </w:p>
     <w:p>
@@ -919,7 +918,7 @@
         <w:rPr>
           <w:rFonts w:ascii="SimSun" w:cs="SimSun" w:eastAsia="SimSun" w:hAnsi="SimSun"/>
         </w:rPr>
-        <w:t xml:space="preserve">正面与负面的体验，在冥想中与在梦境中同样真实。我们永远不必害怕冥想会带来什么，并且要相信：凡是升起的，都是成长与培养冥想技能这一过程的一部分。夏威夷人有句妙语——“没有雨，就没有彩虹”，它很好地印证了一个道理：成长往往离不开相反力量的作用。我们的冥想有时如溪水般流淌，有时又被岩石阻挡。重要的是，溪水一直在流。有时我们的冥想断断续续、支离破碎，有时引人入胜，有时又停滞不动。不要在意，让它继续流淌。像从心的一角旁观那样看着，以超然的态度分辨这次冥想的基调。不要去干预它，但要保持觉知。</w:t>
+        <w:t xml:space="preserve">冥想和梦境一样，都会有正面与负面的体验。我们永远不必害怕冥想会带来什么，并且要相信：凡是生起的，都是成长与培养冥想技能这一过程的一部分。夏威夷人有句妙语——“没有雨，就没有彩虹”，它很好地印证了一个道理：成长往往离不开相反力量的作用。我们的冥想有时如溪水般流淌，有时又被岩石阻挡。重要的是，溪水一直在流。有时我们的冥想断断续续、支离破碎，有时引人入胜，有时又停滞不动。不要在意，让它继续流淌。像从心的一角旁观那样看着，以超然的态度分辨这次冥想的基调。不要去干预它，但要保持觉知。</w:t>
       </w:r>
     </w:p>
     <w:p>
@@ -1007,7 +1006,7 @@
         <w:rPr>
           <w:rFonts w:ascii="SimSun" w:cs="SimSun" w:eastAsia="SimSun" w:hAnsi="SimSun"/>
         </w:rPr>
-        <w:t xml:space="preserve">我们的视角往往决定了每次冥想的走向。仪式在这方面大有助益，而我们如何为心灵取景也同样重要。琐事可能突然冒出来抢占位置，不请自来的念头升起后又恳求留下。正如在日常生活中一样，事情往往并不顺遂。巧劲在冥想中与在日常生活中同样管用；无论在哪一边缺了它，我们都只会把事情弄得更糟。</w:t>
+        <w:t xml:space="preserve">我们的视角往往决定了每次冥想的走向。仪式在这方面大有助益，而我们如何为心灵取景也同样重要。琐事可能突然冒出来抢占位置，不请自来的念头生起后又恳求留下。正如在日常生活中一样，事情往往并不顺遂。巧劲在冥想中与在日常生活中同样管用；无论在哪一边缺了它，我们都只会把事情弄得更糟。</w:t>
       </w:r>
     </w:p>
     <w:p>
@@ -1117,7 +1116,7 @@
         <w:rPr>
           <w:rFonts w:ascii="SimSun" w:cs="SimSun" w:eastAsia="SimSun" w:hAnsi="SimSun"/>
         </w:rPr>
-        <w:t xml:space="preserve">我们越是看不出平常念头与冥想之间的分别，冥想就越有深度，我们与冥想之间的亲密感也就越深。亲密是关键，因为冥想是我们与自己的一种关系。当我们逐渐有能力透过冥想看到平常事务与念头显露出多重维度，就会发现：平常的念头与冥想一样，都能揭示心的本性。我们需要冥想技巧来为我们指明这一点，可一旦领会了，就可以把它放到一边。《华严经》说“念念之中，皆含觉悟之种”，是有其道理的。此话虽真，但在很长很长的时间里，我们仍需要助缘。</w:t>
+        <w:t xml:space="preserve">我们越是看不出平常念头与冥想之间的分别，冥想就越有深度，我们与冥想之间的亲密感也就越深。亲密是关键，因为冥想是我们与自己的一种关系。当我们逐渐有能力透过冥想看到平常事务与念头显露出多重维度，就会发现：平常的念头与冥想一样，都能揭示心性。我们需要冥想技巧来为我们指明这一点，可一旦领会了，就可以把它放到一边。《华严经》说“念念之中，皆含菩提种子”，是有其道理的。此话虽真，但在很长很长的时间里，我们仍需要助缘。</w:t>
       </w:r>
     </w:p>
     <w:p>
@@ -1141,19 +1140,19 @@
         <w:rPr>
           <w:rFonts w:ascii="SimSun" w:cs="SimSun" w:eastAsia="SimSun" w:hAnsi="SimSun"/>
         </w:rPr>
-        <w:t xml:space="preserve">上面所说固然不错，但只有当我们是不自觉地这样做时才成立。而在冥想中有意地收紧、放松把握，也自有益处：它能培养心的柔韧。它还能帮助我们本能地察觉心何时在游荡走神，或者——同样糟糕——何时在对某个细节念念不忘。</w:t>
-      </w:r>
-    </w:p>
-    <w:p>
-      <w:pPr>
-        <w:spacing w:after="120" w:line="340"/>
-        <w:ind w:firstLine="480"/>
-      </w:pPr>
-      <w:r>
-        <w:rPr>
-          <w:rFonts w:ascii="SimSun" w:cs="SimSun" w:eastAsia="SimSun" w:hAnsi="SimSun"/>
-        </w:rPr>
-        <w:t xml:space="preserve">深度之中有一个常被忽视的要素：我们总倾向于用一个愉悦的念头去顶替心中升起的不快念头，把后者遮掩过去。这就像想靠多加调料来补救一锅做坏了的汤。自己下厨的人都知道，对一道没做好的菜，最好坦然接受、不去折腾，更绝不该倒掉。我们冥想的滋味不会每天都一样，但也总有例外的时候；遇到那种情形，就如实审视当下的心理状态，并挑战自己，以某种新的方式去欣赏它。宽容自己需要心的灵巧，而灵巧与柔韧一样，都是冥想绝佳的助缘。</w:t>
+        <w:t xml:space="preserve">上面所说固然不错，但只有当我们是不自觉地这样做时才成立。反之，在冥想中有意地收紧、放松把握，则是有益的：它能培养心的柔韧。它还能帮助我们本能地察觉心何时在游荡走神，或者——同样糟糕——何时在对某个细节念念不忘。</w:t>
+      </w:r>
+    </w:p>
+    <w:p>
+      <w:pPr>
+        <w:spacing w:after="120" w:line="340"/>
+        <w:ind w:firstLine="480"/>
+      </w:pPr>
+      <w:r>
+        <w:rPr>
+          <w:rFonts w:ascii="SimSun" w:cs="SimSun" w:eastAsia="SimSun" w:hAnsi="SimSun"/>
+        </w:rPr>
+        <w:t xml:space="preserve">深度之中有一个常被忽视的要素：我们总倾向于用一个愉悦的念头去顶替心中生起的不快念头，把后者遮掩过去。这就像想靠多加调料来补救一锅做坏了的汤。自己下厨的人都知道，对一道没做好的菜，最好坦然接受、不去折腾，更绝不该倒掉。我们冥想的滋味不会每天都一样，但也总有例外的时候；遇到那种情形，就如实审视当下的心理状态，并挑战自己，以某种新的方式去欣赏它。宽容自己需要心的灵巧，而灵巧与柔韧一样，都是冥想绝佳的助缘。</w:t>
       </w:r>
     </w:p>
     <w:p>
@@ -1201,7 +1200,7 @@
         <w:rPr>
           <w:rFonts w:ascii="SimSun" w:cs="SimSun" w:eastAsia="SimSun" w:hAnsi="SimSun"/>
         </w:rPr>
-        <w:t xml:space="preserve">念头或迟钝，或散乱；思考则或有意为之、切中要害，或失焦涣散。有意图的思考从容而审慎。四处狂奔的念头跑得飞快，却哪儿也到不了，毫无目的。忙乱的心既不从容，也无意图。即便纯属偶然地落在了什么有价值的东西上，我们也无从察觉，因为我们早已奔向别处。想得快并没有关系，只要我们坐在驾驶座上，知道自己要去哪里。然而事实往往并非如此；那时，思考只会让我们疲惫不堪。</w:t>
+        <w:t xml:space="preserve">念头或昏沉，或散乱；思考则或有意为之、切中要害，或失焦涣散。有意图的思考从容而审慎。四处狂奔的念头跑得飞快，却哪儿也到不了，毫无目的。忙乱的心既不从容，也无意图。即便纯属偶然地落在了什么有价值的东西上，我们也无从察觉，因为我们早已奔向别处。想得快并没有关系，只要我们坐在驾驶座上，知道自己要去哪里。然而事实往往并非如此；那时，思考只会让我们疲惫不堪。</w:t>
       </w:r>
     </w:p>
     <w:p>
@@ -1240,19 +1239,19 @@
         <w:rPr>
           <w:rFonts w:ascii="SimSun" w:cs="SimSun" w:eastAsia="SimSun" w:hAnsi="SimSun"/>
         </w:rPr>
-        <w:t xml:space="preserve">前面几页所讨论的冥想诸要素，应当被理解为相互关联的，每一要素都支撑着其他要素。我们依需要调配这些要素，就像画家调和他的油彩。每一种处境、每一种心理状态，都需要调配出各自独特的要素配方，以应对我们生活中的种种境况。在某种心境下行之有效的要素，换一种心境也许全然无用。因此，我们必须明白何时该用对治之法、该用哪一种，以及在什么时机施用。很多时候，顺其自然就是最有效的药。虽然不加干预是应对纷乱心境的最佳方式，但懂得如何使用这剂药方，需要老练冥想者的功力。</w:t>
-      </w:r>
-    </w:p>
-    <w:p>
-      <w:pPr>
-        <w:spacing w:after="120" w:line="340"/>
-        <w:ind w:firstLine="480"/>
-      </w:pPr>
-      <w:r>
-        <w:rPr>
-          <w:rFonts w:ascii="SimSun" w:cs="SimSun" w:eastAsia="SimSun" w:hAnsi="SimSun"/>
-        </w:rPr>
-        <w:t xml:space="preserve">我们的内心风景由种种不同的要素构成。这些要素有时协同运作，有时则不然。自然，不与自己交战时的冥想才是最好的冥想。如果蒲团之外的生活失了序，冥想就会成为一场战斗。</w:t>
+        <w:t xml:space="preserve">前面几页所讨论的冥想诸要素，应当看作是相互关联的，每一要素都支撑着其他要素。我们依需要调配这些要素，就像画家调和他的油彩。每一种处境、每一种心理状态，都需要调配出各自独特的要素配方，以应对我们生活中的种种境况。在某种心境下行之有效的要素，换一种心境也许全然无用。因此，我们必须明白何时该用对治之法、该用哪一种，以及在什么时机施用。很多时候，顺其自然就是最有效的药。虽然不加干预是应对纷乱心境的最佳方式，但懂得如何使用这剂药方，需要老练冥想者的功力。</w:t>
+      </w:r>
+    </w:p>
+    <w:p>
+      <w:pPr>
+        <w:spacing w:after="120" w:line="340"/>
+        <w:ind w:firstLine="480"/>
+      </w:pPr>
+      <w:r>
+        <w:rPr>
+          <w:rFonts w:ascii="SimSun" w:cs="SimSun" w:eastAsia="SimSun" w:hAnsi="SimSun"/>
+        </w:rPr>
+        <w:t xml:space="preserve">我们的心灵风景由种种不同的要素构成。这些要素有时协同运作，有时则不然。自然，不与自己交战时的冥想才是最好的冥想。如果蒲团之外的生活失了序，冥想就会成为一场战斗。</w:t>
       </w:r>
     </w:p>
     <w:p>
@@ -1276,19 +1275,19 @@
         <w:rPr>
           <w:rFonts w:ascii="SimSun" w:cs="SimSun" w:eastAsia="SimSun" w:hAnsi="SimSun"/>
         </w:rPr>
-        <w:t xml:space="preserve">我们日常的内心风景，也许只需要重新布置。生活中的矛盾，可能源于事物摆放的方式与调配的比例。面对清除障碍这件事，我们常以为必须扔掉什么，而实际需要的，或许只是重新安排我们的生活。</w:t>
-      </w:r>
-    </w:p>
-    <w:p>
-      <w:pPr>
-        <w:spacing w:after="120" w:line="340"/>
-        <w:ind w:firstLine="480"/>
-      </w:pPr>
-      <w:r>
-        <w:rPr>
-          <w:rFonts w:ascii="SimSun" w:cs="SimSun" w:eastAsia="SimSun" w:hAnsi="SimSun"/>
-        </w:rPr>
-        <w:t xml:space="preserve">生活中的所有要素必须彼此关联，构成一个——姑且称之为“主题”——某种可以辨认的、标识我们是谁的身份。相互冲突的要素，要么加以调和，要么在实在无法契合时予以舍弃。如果内心风景中的某些要素怎么也整合不进来，我们可以试着放下它继续前行。我们无法伪装那些格格不入的东西，也无法靠做点提振精神的事把它忘掉。我们无法把困扰自己的事与喜欢的事（购物、星巴克的一杯拿铁、电话里的闲聊）混在一起加以掩饰，因为我们始终知道它就在那里。就像扫进地毯下的灰尘，它终究可能还是得清走。当然，最好是一开始就别把它扫到地毯下面。</w:t>
+        <w:t xml:space="preserve">我们日常的心灵风景，也许只需要重新布置。生活中的矛盾，可能源于事物摆放的方式与调配的比例。面对清除障碍这件事，我们常以为必须扔掉什么，而实际需要的，或许只是重新安排我们的生活。</w:t>
+      </w:r>
+    </w:p>
+    <w:p>
+      <w:pPr>
+        <w:spacing w:after="120" w:line="340"/>
+        <w:ind w:firstLine="480"/>
+      </w:pPr>
+      <w:r>
+        <w:rPr>
+          <w:rFonts w:ascii="SimSun" w:cs="SimSun" w:eastAsia="SimSun" w:hAnsi="SimSun"/>
+        </w:rPr>
+        <w:t xml:space="preserve">生活中的所有要素必须彼此关联，构成一个——姑且称之为“主题”——某种可以辨认的、标识我们是谁的身份。相互冲突的要素，要么加以调和，要么在实在无法契合时予以舍弃。如果心灵风景中的某些要素怎么也整合不进来，我们可以试着放下它继续前行。我们无法伪装那些格格不入的东西，也无法靠做点提振精神的事把它忘掉。我们无法把困扰自己的事与喜欢的事（购物、星巴克的一杯拿铁、电话里的闲聊）混在一起加以掩饰，因为我们始终知道它就在那里。就像扫进地毯下的灰尘，它终究可能还是得清走。当然，最好是一开始就别把它扫到地毯下面。</w:t>
       </w:r>
     </w:p>
     <w:p>
@@ -1356,7 +1355,7 @@
         <w:rPr>
           <w:rFonts w:ascii="SimSun" w:cs="SimSun" w:eastAsia="SimSun" w:hAnsi="SimSun"/>
         </w:rPr>
-        <w:t xml:space="preserve">初学者不应指望一上来就被冥想修习吸引；总会有几个月的磨合期。然而，如果经过一番真诚的努力，我们仍感觉不到与冥想之间的“联结”，就应当寻找一位老师，征询建议。我所说的“老师”，是严格意义上的老师——已经参透教法、证得高深证悟的人。古时候，人们为寻访老师不惜长途跋涉、耗费重金；而如今，优秀的老师每天都在世界各地的城市巡回授课，找到他们并不困难。</w:t>
+        <w:t xml:space="preserve">初学者不应指望一上来就被冥想修习吸引；总会有几个月的磨合期。然而，如果经过一番真诚的努力，我们仍感觉不到与冥想之间的“联结”，就应当寻找一位老师，征询建议。我所说的“老师”，是严格意义上的老师——已经参透教法、证悟甚深的人。古时候，人们为寻访老师不惜长途跋涉、耗费重金；而如今，优秀的老师每天都在世界各地的城市巡回授课，找到他们并不困难。</w:t>
       </w:r>
     </w:p>
     <w:p>
@@ -1380,19 +1379,19 @@
         <w:rPr>
           <w:rFonts w:ascii="SimSun" w:cs="SimSun" w:eastAsia="SimSun" w:hAnsi="SimSun"/>
         </w:rPr>
-        <w:t xml:space="preserve">对初学者所说的这些，对进阶修习者同样适用。老练的冥想者往往每一两年就变换一次修习方式，以保持他们辛苦建立起来的投入感。老练的修习者懂得如何为修习注入活力，初学者却往往不懂。</w:t>
-      </w:r>
-    </w:p>
-    <w:p>
-      <w:pPr>
-        <w:spacing w:after="120" w:line="340"/>
-        <w:ind w:firstLine="480"/>
-      </w:pPr>
-      <w:r>
-        <w:rPr>
-          <w:rFonts w:ascii="SimSun" w:cs="SimSun" w:eastAsia="SimSun" w:hAnsi="SimSun"/>
-        </w:rPr>
-        <w:t xml:space="preserve">无论如何，我们都不想仅仅为了对某种修法尽忠而苦苦忍受它。冥想是一条双向的路：我们投入多少，就理应期待多少回报。这可能需要我们定期微调修习——引入新的要素，或者让既有的修法退下来、搁置一段时间。</w:t>
+        <w:t xml:space="preserve">对初学者所说的这些，对进阶修行者同样适用。老练的冥想者往往每一两年就变换一次修习方式，以保持他们辛苦建立起来的投入感。老练的修行者懂得如何为修习注入活力，初学者却往往不懂。</w:t>
+      </w:r>
+    </w:p>
+    <w:p>
+      <w:pPr>
+        <w:spacing w:after="120" w:line="340"/>
+        <w:ind w:firstLine="480"/>
+      </w:pPr>
+      <w:r>
+        <w:rPr>
+          <w:rFonts w:ascii="SimSun" w:cs="SimSun" w:eastAsia="SimSun" w:hAnsi="SimSun"/>
+        </w:rPr>
+        <w:t xml:space="preserve">无论如何，我们都不想仅仅为了对某种修法尽忠而苦苦忍受它。冥想是一条双向的路：我们投入多少，就理应期待多少回报。这可能需要我们定期微调修习——引入新的要素，或让既有的修法退役，或暂且将其搁置一段时间。</w:t>
       </w:r>
     </w:p>
     <w:p>
@@ -1530,7 +1529,7 @@
         <w:rPr>
           <w:rFonts w:ascii="SimSun" w:cs="SimSun" w:eastAsia="SimSun" w:hAnsi="SimSun"/>
         </w:rPr>
-        <w:t xml:space="preserve">冥想是一个“看”与“看见”的过程。如果你走进剧场找人，却不知道对方长什么样，能看见他的机会就很渺茫。想要看见他，你必须清楚那个人的相貌，才能逐步排除不符的，找到要找的。否则，你要找的人不会自己凸显出来。冥想也是如此。我们寻找的是心的本性，但它并不容易被看见。通过研习和思索可靠的经典与注疏——它们暗示了修行途中将会出现的种种征兆——我们能把胜算大大提高。这就好比一位从未去过夏威夷的旅人，因为研读过旅行指南，抵达时便一眼认出了夏威夷。</w:t>
+        <w:t xml:space="preserve">冥想是一个“看”与“看见”的过程。如果你走进剧场找人，却不知道对方长什么样，能看见他的机会就很渺茫。想要看见他，你必须清楚那个人的相貌，才能逐步排除不符的，找到要找的。否则，你要找的人不会自己凸显出来。冥想也是如此。我们寻找的是心性，但它并不容易被看见。通过研习和思索可靠的经典与注疏——它们暗示了修行途中将会出现的种种征兆——我们能把胜算大大提高。这就好比一位从未去过夏威夷的旅人，因为研读过旅行指南，抵达时便一眼认出了夏威夷。</w:t>
       </w:r>
     </w:p>
     <w:p>
@@ -1566,7 +1565,7 @@
         <w:rPr>
           <w:rFonts w:ascii="SimSun" w:cs="SimSun" w:eastAsia="SimSun" w:hAnsi="SimSun"/>
         </w:rPr>
-        <w:t xml:space="preserve">研读一部经文时，即便已经读过许多遍，我们仍会兴奋不已、被深深吸引。经典的天才之处，在于其诠释层次的多重维度。即使两个人读同一部经文，也会依各自业力上的需要去看它，并以独特的方式运用其中的真理。</w:t>
+        <w:t xml:space="preserve">研读一部经文时，即便已经读过许多遍，我们仍会兴奋不已、被深深吸引。经典的精妙之处，在于它可作多层次、多维度的诠释。即使两个人读同一部经文，也会依各自业力上的需要去看它，并以独特的方式运用其中的真理。</w:t>
       </w:r>
     </w:p>
     <w:p>
@@ -1622,7 +1621,7 @@
         <w:rPr>
           <w:rFonts w:ascii="SimSun" w:cs="SimSun" w:eastAsia="SimSun" w:hAnsi="SimSun"/>
         </w:rPr>
-        <w:t xml:space="preserve">即使我们并未察觉，研习与思索也在为冥想预备着心。事实上，冥想中的心会把学习时那种理智与思辨的活动抛在身后，消融于一种不加断定的觉知之中。凡是我们研习和思索过的内容，都会在我们毫无察觉的情况下影响我们的冥想，而这正是它应有的方式。我们不应试图在冥想时唤起“学来”的观念，因为冥想与研习、思索是不同的功课。笼统概观适用于冥想，条分缕析则不适用。当我们处于正确冥想所特有的心境之中，和谐、平衡、对称便会自然生起。如果发现自己被岔到了具体细节上，就必须让注意力散焦，去感受那颗不加造作的心天然的开阔——它不特别看着任何东西，却又无一物不在眼中。如果心中塞满了粗重的对象，就要把它们融成一片，把觉知安放在心口的部位。去到那里，并停留在那里。当你又漂向具体细节时，就再次化开焦点，安住于一种没有任何细节生起的状态。</w:t>
+        <w:t xml:space="preserve">即使我们并未察觉，研习与思索也在为冥想预备着心。事实上，冥想中的心会把学习时那种理智与思辨的活动抛在身后，消融于一种不加断定的觉知之中。凡是我们研习和思索过的内容，都会在我们毫无察觉的情况下影响我们的冥想，而这正是它应有的方式。我们不应试图在冥想时唤起“学来”的观念，因为冥想与研习、思索是不同的功课。笼统概观适用于冥想，条分缕析则不适用。当我们处于正确冥想所特有的心境之中，和谐、平衡、对称便会自然生起。如果发现自己岔到了具体细节上，就必须让注意力散焦，去感受那颗不加造作的心天然的开阔——它不特别看着任何东西，却又无一物不在眼中。如果心中塞满了粗重的对象，就要把它们融成一片，把觉知安放在心口的部位。去到那里，并停留在那里。当你又漂向具体细节时，就再次化开焦点，安住于一种没有任何细节生起的状态。</w:t>
       </w:r>
     </w:p>
     <w:p>
@@ -1702,7 +1701,7 @@
         <w:rPr>
           <w:rFonts w:ascii="SimSun" w:cs="SimSun" w:eastAsia="SimSun" w:hAnsi="SimSun"/>
         </w:rPr>
-        <w:t xml:space="preserve">一套好的灵性成长策略，应当在心里勾画出一条包含全部必要元素的路径，并预想我们希望达到的结果。是的，我们想要平静与幸福，但什么是平静与幸福？你会发现，一位娴熟的冥想者对这些简单字眼的定义，与我们所能想象的大相径庭。常见的陷阱之一，是为了获得极乐的心境、光明或神通而冥想。然而，即使这些境界真的达到了，我们可能依然既不幸福也不平静。经中告诫我们要提防错误而自私的动机。神通固然可能生起，但它们与正道相去甚远；一旦贪执于此，它们便成为严重的障碍。</w:t>
+        <w:t xml:space="preserve">一套好的灵性成长策略，应当在心里勾画出一条包含全部必要元素的路径，并预想我们希望达到的结果。是的，我们想要平静与幸福，但什么是平静与幸福？你会发现，一位娴熟的冥想者对这些简单字眼的定义，与我们所能想象的大相径庭。常见的陷阱之一，是为了获得喜乐的心境、光明或神通而冥想。然而，即使这些境界真的达到了，我们可能依然既不幸福也不平静。经中告诫我们要提防错误而自私的动机。神通固然可能生起，但它们与正道相去甚远；一旦贪执于此，它们便成为严重的障碍。</w:t>
       </w:r>
     </w:p>
     <w:p>
@@ -1790,7 +1789,7 @@
         <w:rPr>
           <w:rFonts w:ascii="SimSun" w:cs="SimSun" w:eastAsia="SimSun" w:hAnsi="SimSun"/>
         </w:rPr>
-        <w:t xml:space="preserve">关于预想，我们已谈了不少，但尚未考虑与它相对的那一面。依据经过检验、行之有效的经典建议来制定策略，其重要性怎么强调都不为过；但我们也应当懂得回顾的价值——回顾一天当中所经历的种种冥想状态，无论是在冥想时，还是离开座垫之后。每隔一段时间，我们应当花上一两个小时，回想自己都经历了什么。是否感到腿疼或背痛、昏沉、困惑、焦虑、无聊、愤怒、困倦、意兴索然、兴高采烈，或其他心理状态？在我们记得的这些状况出现之前，可曾发生过什么？它们给我们什么感受？我们又是如何应对的？定期检视，就像给汽车做保养检查，既能防止修习“抛锚”，也能指出我们哪里做得好，从而进一步拓展、深化这些方面。</w:t>
+        <w:t xml:space="preserve">关于预想，我们已有所谈及，但尚未考虑与它相对的那一面。依据经过检验、行之有效的经典建议来制定策略，其重要性怎么强调都不为过；但我们也应当懂得回顾的价值——回顾一天当中所经历的种种冥想状态，无论是在冥想时，还是离开座垫之后。每隔一段时间，我们应当花上一两个小时，回想自己都经历了什么。是否感到腿疼或背痛、昏沉、困惑、焦虑、无聊、愤怒、困倦、意兴索然、兴高采烈，或其他心理状态？在我们记得的这些状况出现之前，可曾发生过什么？它们给我们什么感受？我们又是如何应对的？定期检视，就像给汽车做保养检查，既能防止修习“抛锚”，也能指出我们哪里做得好，从而进一步拓展、深化这些方面。</w:t>
       </w:r>
     </w:p>
     <w:p>
@@ -1834,7 +1833,7 @@
         <w:rPr>
           <w:rFonts w:ascii="SimSun" w:cs="SimSun" w:eastAsia="SimSun" w:hAnsi="SimSun"/>
         </w:rPr>
-        <w:t xml:space="preserve">光明以多种形式显现。出于种种原因，我们每个人心里都藏着自我怀疑，当这些怀疑消解时，光明便会生起。然而，这种体验未必伴随着光。对分析性冥想诸课题的探究也是如此：部分与整体的关系（即“分体论论证”，mereological argument）、自与他、性质及性质所依附的基础。凡是以打破我们思维中根深蒂固的错误为目标的观修，都可能伴随着光，也可能没有。</w:t>
+        <w:t xml:space="preserve">光明以多种形式显现。出于种种原因，我们每个人心里都藏着自我怀疑，当这些怀疑消解时，光明便会生起。然而，这种体验未必伴随着光。对分析式冥想诸课题的探究也是如此：部分与整体的关系（即“分体论论证”，mereological argument）、自与他、性质及性质所依附的基础。凡是以打破我们思维中根深蒂固的错误为目标的观修，都可能伴随着光，也可能没有。</w:t>
       </w:r>
     </w:p>
     <w:p>
@@ -2064,7 +2063,7 @@
         <w:rPr>
           <w:rFonts w:ascii="SimSun" w:cs="SimSun" w:eastAsia="SimSun" w:hAnsi="SimSun"/>
         </w:rPr>
-        <w:t xml:space="preserve">人们常常过度认同自己的努力和目标，忘了冥想的目的不是制造一种心境，而是看见一种始终都在的心境。我们看不见它，不等于它不存在。与其掌握五花八门的“高级”技巧，不如用几种简单的冥想方法，这样更容易正确地运用修习。复杂和繁多会让心背上技巧本身的负担，而顾不上心本身。射箭时如果过分在意自己的姿势，箭还没离弦，就已经脱靶了。</w:t>
+        <w:t xml:space="preserve">人们常常过度认同自己的努力和目标，忘了冥想的目的不是制造一种心境，而是看见一种始终都在的心境。我们看不见它，不等于它不存在。与其掌握五花八门的“高级”技巧，不如用几种简单的冥想技巧，这样更容易正确地进行修习。复杂和繁多会让心背上技巧本身的负担，而顾不上心本身。射箭时如果过分在意自己的姿势，箭还没离弦，就已经脱靶了。</w:t>
       </w:r>
     </w:p>
     <w:p>
@@ -2212,19 +2211,19 @@
         <w:rPr>
           <w:rFonts w:ascii="SimSun" w:cs="SimSun" w:eastAsia="SimSun" w:hAnsi="SimSun"/>
         </w:rPr>
-        <w:t xml:space="preserve">这些“家族”能为我们的冥想提供多样的情感助力。凡是去过寺院、在僧尼们进行与某一家族相应的祈祷唱诵时参加过“普迦”（puja）法会的人，都会注意到这些仪式所激发的情感是何等不同。</w:t>
-      </w:r>
-    </w:p>
-    <w:p>
-      <w:pPr>
-        <w:spacing w:after="120" w:line="340"/>
-        <w:ind w:firstLine="480"/>
-      </w:pPr>
-      <w:r>
-        <w:rPr>
-          <w:rFonts w:ascii="SimSun" w:cs="SimSun" w:eastAsia="SimSun" w:hAnsi="SimSun"/>
-        </w:rPr>
-        <w:t xml:space="preserve">必须记住：无论修的是哪个“家族”，我们所关心的都应当是把自己全然交付于它。越少分心，就越有把握引生感应。当掌握技巧的心思压过了切身的感受，我们的冥想便荡然无存。我们是去享受其中的，如果过分执迷于技巧，就感受不到诸佛与女神的临在——而把他们迎请到我们面前，正是修法的目的。永远不要忘记你行持仪轨是为了什么。</w:t>
+        <w:t xml:space="preserve">这些“家族”能为我们的冥想提供多样的情感助力。凡是去过寺院、在僧尼们进行与某一家族相应的祈祷唱诵时参加过“法会”（puja）的人，都会注意到这些仪式所激发的情感是何等不同。</w:t>
+      </w:r>
+    </w:p>
+    <w:p>
+      <w:pPr>
+        <w:spacing w:after="120" w:line="340"/>
+        <w:ind w:firstLine="480"/>
+      </w:pPr>
+      <w:r>
+        <w:rPr>
+          <w:rFonts w:ascii="SimSun" w:cs="SimSun" w:eastAsia="SimSun" w:hAnsi="SimSun"/>
+        </w:rPr>
+        <w:t xml:space="preserve">必须记住：无论修的是哪个“家族”，我们所关心的都应当是把自己全然交付于它。越少分心，就越有把握引生感应。当掌握技巧的心思压过了切身的感受，我们的冥想便荡然无存。我们是去享受其中的，如果过分执迷于技巧，就感受不到诸佛与女性本尊的临在——而把他们迎请到我们面前，正是修法的目的。永远不要忘记你行持仪轨是为了什么。</w:t>
       </w:r>
     </w:p>
     <w:p>
@@ -2269,19 +2268,19 @@
         <w:rPr>
           <w:rFonts w:ascii="SimSun" w:cs="SimSun" w:eastAsia="SimSun" w:hAnsi="SimSun"/>
         </w:rPr>
-        <w:t xml:space="preserve">冥想是一种个人化的体验。我的冥想心境也许平静安详，你的却可能紧张而锐利。每个人如何冥想是主观的，由此生出各自独特的心境。但无论我们天生倾向以何种方式冥想，都应保持一贯，并体验到一条贯穿历次冥想、可以辨认的线索——如果你愿意，可称之为一种“风味”。我们应当与自己、与自己的冥想心境融为一体，这样每当坐下冥想，一种熟悉的感觉便会在心中升起，邀请我们向更深处沉潜。</w:t>
-      </w:r>
-    </w:p>
-    <w:p>
-      <w:pPr>
-        <w:spacing w:after="120" w:line="340"/>
-        <w:ind w:firstLine="480"/>
-      </w:pPr>
-      <w:r>
-        <w:rPr>
-          <w:rFonts w:ascii="SimSun" w:cs="SimSun" w:eastAsia="SimSun" w:hAnsi="SimSun"/>
-        </w:rPr>
-        <w:t xml:space="preserve">冥想的心境是通过修习培养出来的，它是冥想在我们身上引起的共鸣。即便是伟大的宗教导师，也以各自的天然禀性或心境著称。例如，已故的密续大师 Kyabje Chatrul Rinpoche 以性情与修习的猛厉闻名，而同样声名卓著的 Kyabje Trulshik Rinpoche 则始终以平和、安详、含蓄见称。有意思的是，这两位大师所修的法门几乎完全相同，而且同属宁玛派传承。要点在于：我们每个人都会发现，随着修习的深入，它将在内在与外在的诸多方面改变我们。</w:t>
+        <w:t xml:space="preserve">冥想是一种个人化的体验。我的冥想心境也许平静安详，你的却可能紧张而锐利。每个人如何冥想是主观的，由此生出各自独特的心境。但无论我们天生倾向以何种方式冥想，都应保持一贯，并体验到一条贯穿历次冥想、可以辨认的线索——如果你愿意，可称之为一种“风味”。我们应当与自己、与自己的冥想心境融为一体，这样每当坐下冥想，一种熟悉的感觉便会在心中生起，邀请我们向更深处沉潜。</w:t>
+      </w:r>
+    </w:p>
+    <w:p>
+      <w:pPr>
+        <w:spacing w:after="120" w:line="340"/>
+        <w:ind w:firstLine="480"/>
+      </w:pPr>
+      <w:r>
+        <w:rPr>
+          <w:rFonts w:ascii="SimSun" w:cs="SimSun" w:eastAsia="SimSun" w:hAnsi="SimSun"/>
+        </w:rPr>
+        <w:t xml:space="preserve">冥想的心境是通过修习培养出来的，它是冥想在我们身上引起的共鸣。即便是伟大的宗教导师，也以各自的天然禀性或心境著称。例如，已故的密法大师怙主恰札仁波切（Kyabje Chatrul Rinpoche）以性情与修习的猛厉闻名，而同样声名卓著的怙主楚西仁波切（Kyabje Trulshik Rinpoche）则始终以平和、安详、含蓄见称。有意思的是，这两位大师所修的法门几乎完全相同，而且同属宁玛派传承。要点在于：我们每个人都会发现，随着修习的深入，它将在内在与外在的诸多方面改变我们。</w:t>
       </w:r>
     </w:p>
     <w:p>
@@ -2349,31 +2348,31 @@
         <w:rPr>
           <w:rFonts w:ascii="SimSun" w:cs="SimSun" w:eastAsia="SimSun" w:hAnsi="SimSun"/>
         </w:rPr>
-        <w:t xml:space="preserve">顶轮为绿色，眉间为白色，喉轮为红色，心轮为蓝色，脐轮为黄色，脊柱底端为蓝色。有趣的是，牛顿出于科学目的做过一个演示——如今几乎写进了每个学生的课本——它为脉轮的光之理论提供了醒目的佐证。牛顿让白光穿过棱镜，射出红、绿、蓝、黄、紫各色光；接着他在旁边放置一块倒置的棱镜，承接从第一块棱镜射出的彩虹般的色光。他发现，多彩的光离开第一块棱镜、进入第二块棱镜之后，射出的又是白光。这说明一切光在本质上都是白光，万物表面发出种种颜色的光，合在一起便是白色。</w:t>
-      </w:r>
-    </w:p>
-    <w:p>
-      <w:pPr>
-        <w:spacing w:after="120" w:line="340"/>
-        <w:ind w:firstLine="480"/>
-      </w:pPr>
-      <w:r>
-        <w:rPr>
-          <w:rFonts w:ascii="SimSun" w:cs="SimSun" w:eastAsia="SimSun" w:hAnsi="SimSun"/>
-        </w:rPr>
-        <w:t xml:space="preserve">我不知道为何各个传承中的颜色互有出入，但依据《时轮金刚续》（Kalachakra Tantra）——因出自单一源头而被视为最纯净的密续——颜色如上所列，唯一的例外是心轮，在此体系中可为蓝色或黑色。每个脉轮和颜色还配有相应的咒音，需与颜色一并观想。依次经过各个脉轮时，你要观想自己的脊柱仿佛中脉两侧各有一条蛇，以相反的方向盘旋上升，在每个脉轮处交叉穿行，并在每个能量中心相互缠绕时放出相应颜色的光。达赖喇嘛在华盛顿特区讲学时，我曾就此接受过十天的指导，因此可以肯定地说：这确实很难。但正如达赖喇嘛所说，我们不应被它的难度吓住，而应每天至少花十五分钟投入这一观修。</w:t>
-      </w:r>
-    </w:p>
-    <w:p>
-      <w:pPr>
-        <w:spacing w:after="120" w:line="340"/>
-        <w:ind w:firstLine="480"/>
-      </w:pPr>
-      <w:r>
-        <w:rPr>
-          <w:rFonts w:ascii="SimSun" w:cs="SimSun" w:eastAsia="SimSun" w:hAnsi="SimSun"/>
-        </w:rPr>
-        <w:t xml:space="preserve">可以想见，脉轮的各色光终将在某一刻融为一体，化作那道人们常说的、沿脊柱升起的白光。这个目标我尚未达成，但我认识许多已经达成的人，其中一位还能随意为之。此修与一切冥想修习的关键，都在于不执著，并在努力本身中找到喜悦。我们当然不想去操纵自己的心，硬要“制造”出这样一种状态。让它自行生起，成为一份不期而至的惊喜。</w:t>
+        <w:t xml:space="preserve">顶轮为绿色，眉间为白色，喉轮为红色，心轮为蓝色，脐轮为黄色，脊柱底端为蓝色。有趣的是，牛顿出于科学目的做过一个演示——如今几乎写进了每个学生的课本——它惊人地验证了脉轮的光之理论。牛顿让白光穿过棱镜，射出红、绿、蓝、黄、紫各色光；接着他在旁边放置一块倒置的棱镜，承接从第一块棱镜射出的彩虹般的色光。他发现，多彩的光离开第一块棱镜、进入第二块棱镜之后，射出的又是白光。这说明一切光在本质上都是白光，万物表面发出种种颜色的光，合在一起便是白色。</w:t>
+      </w:r>
+    </w:p>
+    <w:p>
+      <w:pPr>
+        <w:spacing w:after="120" w:line="340"/>
+        <w:ind w:firstLine="480"/>
+      </w:pPr>
+      <w:r>
+        <w:rPr>
+          <w:rFonts w:ascii="SimSun" w:cs="SimSun" w:eastAsia="SimSun" w:hAnsi="SimSun"/>
+        </w:rPr>
+        <w:t xml:space="preserve">我不知道为何各个传承中的颜色互有出入，但依据《时轮金刚续》（Kalachakra Tantra）——因出自单一源头而被视为最纯净的密续——颜色如上所列，唯一的例外是心轮，在此体系中可为蓝色或黑色。每个脉轮和颜色还配有相应的种子字，需与颜色一并观想。依次经过各个脉轮时，你要观想自己的脊柱仿佛中脉两侧各有一条蛇，以相反的方向盘旋上升，在每个脉轮处交叉穿行，并在每个能量中心相互缠绕时放出相应颜色的光。达赖喇嘛在华盛顿特区讲学时，我曾就此接受过十天的指导，因此可以肯定地说：这确实很难。但正如达赖喇嘛所说，我们不应被它的难度吓住，而应每天至少花十五分钟投入这一观修。</w:t>
+      </w:r>
+    </w:p>
+    <w:p>
+      <w:pPr>
+        <w:spacing w:after="120" w:line="340"/>
+        <w:ind w:firstLine="480"/>
+      </w:pPr>
+      <w:r>
+        <w:rPr>
+          <w:rFonts w:ascii="SimSun" w:cs="SimSun" w:eastAsia="SimSun" w:hAnsi="SimSun"/>
+        </w:rPr>
+        <w:t xml:space="preserve">可以想见，脉轮的各色光终将在某一刻融为一体，化作那道人们常说的、沿脊柱升起的白光。这个目标我尚未达成，但我认识许多已经达成的人，其中一位还能随意为之。此修与一切冥想修习的关键，都在于不执着，并在努力本身中找到喜悦。我们当然不想去操纵自己的心，硬要“制造”出这样一种状态。让它自行生起，成为一份不期而至的惊喜。</w:t>
       </w:r>
     </w:p>
     <w:p>
@@ -2453,7 +2452,7 @@
         <w:rPr>
           <w:rFonts w:ascii="SimSun" w:cs="SimSun" w:eastAsia="SimSun" w:hAnsi="SimSun"/>
         </w:rPr>
-        <w:t xml:space="preserve">放空时，我们松开冥想的握持，却不完全撒手。我们要保留足够的握持，使自己仍在掌控之中，但要轻柔——像用一根细线而非粗绳引马，又像飞钓者收放手中的钓线。用力要尽可能少，以免失去冥想的觉知；又要足够，以免彻底飘走之后遭遇那令人难受的警醒。重新回到正题绝不应突兀，而应从放空式冥想平滑过渡到洞见冥想。</w:t>
+        <w:t xml:space="preserve">放空时，我们松开冥想的握持，却不完全撒手。我们要保留足够的握持，使自己仍在掌控之中，但要轻柔——像用一根细线而非粗绳引马，又像飞钓者收放手中的钓线。所用的力要尽可能少，少到刚好不失去冥想的觉知；但又要足够，以免彻底飘走之后遭遇那令人难受的警醒。重新回到正题绝不应突兀，而应从放空式冥想平滑过渡到洞见冥想。</w:t>
       </w:r>
     </w:p>
     <w:p>
@@ -2480,7 +2479,7 @@
           <w:sz w:val="28"/>
           <w:szCs w:val="28"/>
         </w:rPr>
-        <w:t xml:space="preserve">没有什么非黑即白</w:t>
+        <w:t xml:space="preserve">世上没有非黑即白的事</w:t>
       </w:r>
     </w:p>
     <w:p>
@@ -2509,7 +2508,7 @@
         <w:rPr>
           <w:rFonts w:ascii="SimSun" w:cs="SimSun" w:eastAsia="SimSun" w:hAnsi="SimSun"/>
         </w:rPr>
-        <w:t xml:space="preserve">生活中的小细节几乎总显得格外重要，重要得与其分量不成比例。它们想起来轻松，似乎也值得咀嚼。但对这些那些的思来想去，是以牺牲根本问题登上舞台中央为代价的。那些辨认无明、欲望、情绪的主人、“自我”以及其他人人共有的生命要素的存在性问题，本亟需被照亮，却始终进不了我们考量的视野。当“重要的事”容易量化时，我们便更容易以为自己是在“思考”它们：“我的房间该刷什么颜色？”“今晚要不要去看电影？”“新认识的那个人，他会不会来电话？”这些问题个个都有嚼头，却只会把我们引向同一“类”世俗思维，足以耗尽一生。而思考无明及其本质与起源，思考欲望以及如何理解它，思考是谁在生、谁在死、又有什么（如果有的话）在延续——这类念头令我们本能地退缩，或觉得望而生畏，而它们正是罗素所说的重要之事。我们不应在要紧的思考面前退缩。</w:t>
+        <w:t xml:space="preserve">生活中的小细节几乎总显得格外重要，重要得与其分量不成比例。它们想起来轻松，似乎也值得咀嚼。但对这样那样的事思来想去，代价便是根本问题无从占据舞台中央。那些存在性的问题——关乎无明、欲望、情绪的主人、“自我”，以及其他人人共有的生命要素——亟待照亮，却始终进不了我们考量的视野。当“重要的事”容易量化时，我们便更容易以为自己是在“思考”它们：“我的房间该刷什么颜色？”“今晚要不要去看电影？”“新认识的那个人，他会不会来电话？”这些问题个个都有嚼头，却只会把我们引向同一“类”世俗思维，足以耗尽一生。而思考无明及其本质与起源，思考欲望以及如何理解它，思考是谁在生、谁在死、又有什么（如果有的话）在延续——这类念头令我们本能地退缩，或觉得望而生畏，而它们正是罗素所说的重要之事。我们不应在要紧的思考面前退缩。</w:t>
       </w:r>
     </w:p>
     <w:p>
@@ -2557,7 +2556,7 @@
         <w:rPr>
           <w:rFonts w:ascii="SimSun" w:cs="SimSun" w:eastAsia="SimSun" w:hAnsi="SimSun"/>
         </w:rPr>
-        <w:t xml:space="preserve">当我们把阴影中的要素带到亮处，并中和那些吸引力大却无甚实质价值的要素时，心灵风景就更有能力增益我们的冥想体验、加速我们的成长。我们不要把念头归类为好或坏。只要消除反差、让一切归于灰色，就足够了。一片看似无事发生的中性心灵风景，最有利于冥想，也最能支持冥想，是每位冥想者都应努力趋向的心灵风景。</w:t>
+        <w:t xml:space="preserve">当我们把阴影中的要素带到亮处，并中和那些吸引力大却无甚实质价值的要素时，心灵风景就更有能力增益我们的冥想体验、加速我们的成长。我们不要把念头归类为好或坏。只要消除反差、让一切归于灰色，就足够了。一片看似什么都没发生的中性心灵风景，最有利于冥想，也最能支持冥想，是每位冥想者都应努力趋向的心灵风景。</w:t>
       </w:r>
     </w:p>
     <w:p>
@@ -2630,19 +2629,19 @@
         <w:rPr>
           <w:rFonts w:ascii="SimSun" w:cs="SimSun" w:eastAsia="SimSun" w:hAnsi="SimSun"/>
         </w:rPr>
-        <w:t xml:space="preserve">我们要建立均衡的修习，以一种没有高峰也没有低谷的方式发展。人们常常一味强化强项，却以补足弱项为代价。比如，有人长于持咒，并能借此入三摩地，可他的调息功夫却毫无进展，这时他也许会忍不住专攻咒语而弃呼吸于不顾。这是一个错误。又比如，有人调息与持咒俱佳，却对分析式冥想（参问自我）一无所知，于是干脆跳过分析式冥想，把全部精力都倾注在调息与咒语上。</w:t>
-      </w:r>
-    </w:p>
-    <w:p>
-      <w:pPr>
-        <w:spacing w:after="120" w:line="340"/>
-        <w:ind w:firstLine="480"/>
-      </w:pPr>
-      <w:r>
-        <w:rPr>
-          <w:rFonts w:ascii="SimSun" w:cs="SimSun" w:eastAsia="SimSun" w:hAnsi="SimSun"/>
-        </w:rPr>
-        <w:t xml:space="preserve">我们要发展全面的修习，因为最能培养觉悟品质的，正是全面的修习。忽视均衡发展也完全可能进入高妙的心识状态，但高妙的心识状态并不等于觉悟的品质。一个人尽可以在依然贪婪、易怒、报复心重、欲望炽盛、缺乏智慧与慈悲等品质的情况下证得三摩地。</w:t>
+        <w:t xml:space="preserve">我们要建立均衡的修习，以一种没有高峰也没有低谷的方式发展。人们常常只顾进一步强化自己的强项，而把提升弱项抛在一边。比如，有人长于持咒，并能借此入定，可他的调息功夫却毫无进展，这时他也许会忍不住专攻咒语而弃呼吸于不顾。这是一个错误。又比如，有人调息与持咒俱佳，却对分析式冥想（自我参究）一无所知，就可能干脆跳过分析式冥想，把全部精力都倾注在调息与咒语上。</w:t>
+      </w:r>
+    </w:p>
+    <w:p>
+      <w:pPr>
+        <w:spacing w:after="120" w:line="340"/>
+        <w:ind w:firstLine="480"/>
+      </w:pPr>
+      <w:r>
+        <w:rPr>
+          <w:rFonts w:ascii="SimSun" w:cs="SimSun" w:eastAsia="SimSun" w:hAnsi="SimSun"/>
+        </w:rPr>
+        <w:t xml:space="preserve">我们要发展全面的修习，因为最能培养觉悟品质的，正是全面的修习。忽视均衡发展也完全可能进入高妙的心识状态，但高妙的心识状态并不等于觉悟的品质。一个人尽可以在依然贪婪、易怒、报复心重、欲望炽盛、缺乏智慧与慈悲等品质的情况下证得三昧。</w:t>
       </w:r>
     </w:p>
     <w:p>
@@ -2699,19 +2698,19 @@
         <w:rPr>
           <w:rFonts w:ascii="SimSun" w:cs="SimSun" w:eastAsia="SimSun" w:hAnsi="SimSun"/>
         </w:rPr>
-        <w:t xml:space="preserve">正统的修习是最稳妥的选择。它经受了时间的考验，并演化出诸多传承。沿用久经磨砺的冥想技巧与古老典籍，比某些想找捷径的人偏爱的“小白鼠”式试验明智得多。那种试验的结局从来都不好。正统修习只有投入时间才能被理解。凡依循古代典籍的修习，都不会给我们套上紧身衣。恰恰相反，当我们开始明白修习是怎么回事，就会发现要让它奏效，必须依照各自独特的性情、兴趣与能力加以调整。修习不是照章盖在我们每个人身上的橡皮图章。相反，我们也许读同一部典籍、修同一种冥想，但每个人都会以自己独特的方式诠释文本，并以只适合自己、不适合任何他人的方式修习冥想。</w:t>
-      </w:r>
-    </w:p>
-    <w:p>
-      <w:pPr>
-        <w:spacing w:after="120" w:line="340"/>
-        <w:ind w:firstLine="480"/>
-      </w:pPr>
-      <w:r>
-        <w:rPr>
-          <w:rFonts w:ascii="SimSun" w:cs="SimSun" w:eastAsia="SimSun" w:hAnsi="SimSun"/>
-        </w:rPr>
-        <w:t xml:space="preserve">找不到“自己”的节奏，冥想与研习就会味同嚼蜡，成为一场我们未必能赢的耐力赛。要明白，灵性修习或许是齐一的，其结果却因人而异。齐一的修习会被裁剪得合乎我们的需要与能力。我们应当欢迎这一点，但绝不强求。我们应当留意征兆，并乐于接纳改变的提示。而且，当它们在心中升起时，我们必须知道何时该勒紧缰绳、何时该放松掌控。心体的柔韧与身体的柔韧，对于心的修炼，正如对于瑜伽的身体修炼一样重要。我们绝不可僵硬，而要始终保持可塑，但这份可塑要落在一定的边界之内。告知我们这些边界，是经典的职责；而冥想技巧则会把纪律圈定在有效的范围之内。两者都有待我们去探究。</w:t>
+        <w:t xml:space="preserve">正统的修习是最稳妥的选择。它经受了时间的考验，并演化出诸多传承。沿用久经磨砺的冥想技巧与古老典籍，比某些想找捷径的人偏爱的“小白鼠”式试验明智得多。那种试验的结局从来都不好。正统修习，唯有投入时间才能理解。凡依循古代典籍的修习，都不会给我们套上紧身衣。恰恰相反，当我们开始明白修习是怎么回事，就会发现要让它奏效，必须依照各自独特的性情、兴趣与能力加以调整。修习不是照章盖在我们每个人身上的橡皮图章。相反，我们也许读同一部典籍、修同一种冥想，但每个人都会以自己独特的方式诠释文本，并以只适合自己、不适合任何他人的方式修习冥想。</w:t>
+      </w:r>
+    </w:p>
+    <w:p>
+      <w:pPr>
+        <w:spacing w:after="120" w:line="340"/>
+        <w:ind w:firstLine="480"/>
+      </w:pPr>
+      <w:r>
+        <w:rPr>
+          <w:rFonts w:ascii="SimSun" w:cs="SimSun" w:eastAsia="SimSun" w:hAnsi="SimSun"/>
+        </w:rPr>
+        <w:t xml:space="preserve">找不到“自己”的节奏，冥想与研习就会味同嚼蜡，成为一场我们未必能赢的耐力赛。要明白，灵性修习或许是齐一的，其结果却因人而异。齐一的修习会被裁剪得合乎我们的需要与能力。我们应当欢迎这一点，但绝不强求。我们应当留意征兆，并乐于接纳改变的提示。而且，当它们在心中生起时，我们必须知道何时该勒紧缰绳、何时该放松掌控。心的柔韧与身体的柔韧，对于心的修炼，正如对于瑜伽的身体修炼一样重要。我们绝不可僵硬，而要始终保持可塑，但这份可塑要落在一定的边界之内。经典的职责，就是告诉我们这些边界，以及哪些冥想技巧能把纪律圈定在有效的范围之内。两者都有待我们去探究。</w:t>
       </w:r>
     </w:p>
     <w:p>
@@ -2779,7 +2778,7 @@
         <w:rPr>
           <w:rFonts w:ascii="SimSun" w:cs="SimSun" w:eastAsia="SimSun" w:hAnsi="SimSun"/>
         </w:rPr>
-        <w:t xml:space="preserve">修习像一场婚姻，需要包容与耐心。弃船而去或许诱人，但我们很可能再度面对类似的问题，这一点不容忽视。情绪低落或修习变得乏味时，千万不要归咎于修习本身。聪明的做法，是在熟悉的框架之内，用新的方式为修习注入活力。提振修习的上佳办法，是拜见一位觉悟的大师，或参加一次教学静修营。与朋友谈谈自己的问题、坦诚相待，能减轻我们的负担，因为不在局中的人能帮我们看清自己看不清的东西。阅读大师传记，甚至研习数学、生物学等非灵性领域，也能激发心智，成为提振冥想修习的助缘。最后但同样重要的，是 Paramahansa Yogananda 的建议：“放一两周假。”</w:t>
+        <w:t xml:space="preserve">修习像一场婚姻，需要包容与耐心。弃船而去或许诱人，但我们很可能再度面对类似的问题，这一点不容忽视。情绪低落或修习变得乏味时，千万不要归咎于修习本身。聪明的做法，是在熟悉的框架之内，用新的方式为修习注入活力。为修习提亮增色的上佳办法，是拜见一位开悟的大师，或参加一次教学闭关。与朋友谈谈自己的问题、坦诚相待，能减轻我们的负担，因为不在局中的人能帮我们看清自己看不清的东西。阅读大师传记，甚至研习数学、生物学等非灵性领域，也能激发心智，成为提振冥想修习的助缘。最后但同样重要的，是 帕拉宏撒·尤迦南达（Paramahansa Yogananda） 的建议：“放一两周假。”</w:t>
       </w:r>
     </w:p>
     <w:p>
@@ -2845,7 +2844,7 @@
         <w:rPr>
           <w:rFonts w:ascii="SimSun" w:cs="SimSun" w:eastAsia="SimSun" w:hAnsi="SimSun"/>
         </w:rPr>
-        <w:t xml:space="preserve">我们必须了解自己的心理，并意识到好恶之心恐怕是我们最坏的敌人。应当让理性与分析统辖我们的“偏好”，以便建立能实现我们志愿的有效而均衡的修习。我们做佛法修行者不是为了享乐。佛法修习是件严肃的事，需要大量时间与努力。时间即生命，应当谨慎而明智地使用。冥想不是娱乐。多数时候它是枯燥的，需要经年累月的耐心。虽然偶尔会有充满喜乐的洞见让我们知道自己在前进，但这样的洞见稀少而难得。在此期间，我们必须努力精进，因为我们在乎自己。</w:t>
+        <w:t xml:space="preserve">我们必须了解自己的心理，并意识到好恶之心恐怕是我们最大的敌人。应当让理性与分析统辖我们的“偏好”，以便建立能实现我们志愿的有效而均衡的修习。我们做佛法修行者不是为了享乐。佛法修习是件严肃的事，需要大量时间与努力。时间即生命，应当谨慎而明智地使用。冥想不是娱乐。多数时候它是枯燥的，需要经年累月的耐心。虽然偶尔会有充满喜乐的洞见让我们知道自己在前进，但这样的洞见稀少而难得。在此期间，我们必须努力精进，因为我们在乎自己。</w:t>
       </w:r>
     </w:p>
     <w:p>
@@ -2869,19 +2868,19 @@
         <w:rPr>
           <w:rFonts w:ascii="SimSun" w:cs="SimSun" w:eastAsia="SimSun" w:hAnsi="SimSun"/>
         </w:rPr>
-        <w:t xml:space="preserve">身为佛法修行者，我们必须学会过低反差的生活。我所见过的大多数大师，其心境都可以用“沉静内敛”来形容。他们身上有一种极具感染力的平稳，笃定自信而又收放有度。他们的光调暗了，也被守护着。在这条路上走出些时日之前，高反差的生活几乎难以避免；但随着修习成熟，一切都会平缓下来。在几个月乃至几年里，蒲团上与蒲团下的界线会非常分明。然而随着时间推移，我们会开始发现，冥想越来越多地滋养着我们的日常生活。到那时，两个世界将同等地助成我们的灵性志愿。任何一个世界都不再显得是对另一个的偏离，也不显得更“灵性”。我们会像期待冥想结束后去做其他活动一样，期待着冥想。</w:t>
-      </w:r>
-    </w:p>
-    <w:p>
-      <w:pPr>
-        <w:spacing w:after="120" w:line="340"/>
-        <w:ind w:firstLine="480"/>
-      </w:pPr>
-      <w:r>
-        <w:rPr>
-          <w:rFonts w:ascii="SimSun" w:cs="SimSun" w:eastAsia="SimSun" w:hAnsi="SimSun"/>
-        </w:rPr>
-        <w:t xml:space="preserve">上了年纪的读者也许还记得那句广告词——“条条大路通西尔斯”（All roads lead to Sears）。话虽如此，这句话其实没什么意义，因为“条条”大路既通西尔斯，也通往任何别的地方。但当我们志在自知，条条大路便真的都通向自知。心的本性本自光明，这意味着只要我们让心倾向那个方向，就必然会找到它。</w:t>
+        <w:t xml:space="preserve">身为佛法修行者，我们必须学会过低反差的生活。我所见过的大多数大师，其心境都可以用“沉静内敛”来形容。他们身上有一种极具感染力的平稳，笃定自信而又收放有度。他们把自己的光调暗了、守护起来。在这条路上走出些时日之前，高反差的生活几乎难以避免；但随着修习成熟，一切都会平缓下来。在几个月乃至几年里，蒲团上与蒲团下的界线会非常分明。然而随着时间推移，我们会开始发现，冥想越来越多地滋养着我们的日常生活。到那时，两个世界将同等地助成我们的灵性志愿。任何一个世界都不再显得是对另一个的偏离，也不显得更“灵性”。我们会像期待冥想结束后去做其他活动一样，期待着冥想。</w:t>
+      </w:r>
+    </w:p>
+    <w:p>
+      <w:pPr>
+        <w:spacing w:after="120" w:line="340"/>
+        <w:ind w:firstLine="480"/>
+      </w:pPr>
+      <w:r>
+        <w:rPr>
+          <w:rFonts w:ascii="SimSun" w:cs="SimSun" w:eastAsia="SimSun" w:hAnsi="SimSun"/>
+        </w:rPr>
+        <w:t xml:space="preserve">上了年纪的读者也许还记得那句广告词——“条条大路通西尔斯”（All roads lead to Sears）。话虽如此，这句话其实没什么意义，因为“条条”大路既通西尔斯，也通往任何别的地方。但当我们志在自知，条条大路便真的都通向自知。心性本自光明，这意味着只要我们让心倾向那个方向，就必然会找到它。</w:t>
       </w:r>
     </w:p>
     <w:p>
@@ -2908,7 +2907,7 @@
           <w:sz w:val="28"/>
           <w:szCs w:val="28"/>
         </w:rPr>
-        <w:t xml:space="preserve">无事发生</w:t>
+        <w:t xml:space="preserve">什么都没发生</w:t>
       </w:r>
     </w:p>
     <w:p>
@@ -2997,7 +2996,7 @@
         <w:rPr>
           <w:rFonts w:ascii="SimSun" w:cs="SimSun" w:eastAsia="SimSun" w:hAnsi="SimSun"/>
         </w:rPr>
-        <w:t xml:space="preserve">一种表面无事发生、内里却燃着火焰的生活品质，来自这样一种冥想式的生活方式：它已了悟，高反差的生活反映的是内心的不满，而沉静内敛即是知足。</w:t>
+        <w:t xml:space="preserve">一种表面什么都没发生、内里却燃着火焰的生活品质，来自这样一种冥想式的生活方式：它已了悟，高反差的生活反映的是内心的不满，而沉静内敛即是知足。</w:t>
       </w:r>
     </w:p>
     <w:p>
@@ -3158,7 +3157,7 @@
         <w:rPr>
           <w:rFonts w:ascii="SimSun" w:cs="SimSun" w:eastAsia="SimSun" w:hAnsi="SimSun"/>
         </w:rPr>
-        <w:t xml:space="preserve">明智的路数，永远是保持核心修习完好无损。我们可以师从多位上师，但根本上师始终是我们的中心。理当如此。即便证悟极高的大师也有自己的根本上师，同时仍会跟随其他老师学习，从他们那里领受教法、传法与灌顶。这有助于加强他们与根本上师之间的联结。</w:t>
+        <w:t xml:space="preserve">明智的路数，永远是保持核心修习完好无损。我们可以师从多位上师，但根本上师始终是我们的中心。理当如此。即便证悟极高的大师也有自己的根本上师，同时仍会跟随其他老师学习，从他们那里领受教法与种种灌顶。这有助于加强他们与根本上师之间的联结。</w:t>
       </w:r>
     </w:p>
     <w:p>
@@ -3182,7 +3181,7 @@
         <w:rPr>
           <w:rFonts w:ascii="SimSun" w:cs="SimSun" w:eastAsia="SimSun" w:hAnsi="SimSun"/>
         </w:rPr>
-        <w:t xml:space="preserve">佛法修习枯燥乏味，需要长久的坚忍。坚定需要真心。宁可错而坚定，也不要见异思迁。我们的修习也许进展不顺，但换到别处也不会更好。何况，我们并不是自己修习的好裁判。我们不应热切求取收获，也不应因失败而气馁。我们的责任是做好自己的功课，并信任这个过程。研读成功者的生平，很容易看到，艰辛与长久的坚忍正是他们道路的写照。锲而不舍，是一门方向明确的修习的标志。</w:t>
+        <w:t xml:space="preserve">佛法修习枯燥乏味，需要长久的坚忍。坚定需要心力。宁可错而坚定，也不要见异思迁。我们的修习也许进展不顺，但换到别处也不会更好。何况，我们并不是自己修习的好裁判。我们不应热切求取收获，也不应因失败而气馁。我们的责任是做好自己的功课，并信任这个过程。研读成功者的生平，很容易看到，艰辛与长久的坚忍正是他们道路的写照。锲而不舍，是一门方向明确的修习的标志。</w:t>
       </w:r>
     </w:p>
     <w:p>
@@ -3262,7 +3261,7 @@
         <w:rPr>
           <w:rFonts w:ascii="SimSun" w:cs="SimSun" w:eastAsia="SimSun" w:hAnsi="SimSun"/>
         </w:rPr>
-        <w:t xml:space="preserve">人是无法被绝对归类的——无论归成矜持/直率型、亲和型或平淡型，还是按古印度医学体系阿育吠陀（Ayurveda）的说法：纯净、躁动、迟钝，即悦性（sattvic）、激性（rajasic）、惰性（tamasic）。尽管多数时候我们或许都能对应到这三大类中的某一类，偶尔也会飘移到其他种种性情之中。</w:t>
+        <w:t xml:space="preserve">人是无法被绝对归类的——无论是归为矜持/直率型、亲和型或平淡型，还是按古印度医学体系阿育吠陀（Ayurveda）的说法：纯净、躁动、迟钝，即悦性（sattvic）、变性（rajasic）、惰性（tamasic）。尽管多数时候我们或许都能对应到这三大类中的某一类，偶尔也会飘移到其他种种性情之中。</w:t>
       </w:r>
     </w:p>
     <w:p>
@@ -3286,7 +3285,7 @@
         <w:rPr>
           <w:rFonts w:ascii="SimSun" w:cs="SimSun" w:eastAsia="SimSun" w:hAnsi="SimSun"/>
         </w:rPr>
-        <w:t xml:space="preserve">从上述三类或其更宽泛的分支出发，去了解生活中的人，是很有帮助的。这能让我们更准确地读懂他们，避免误解他们的言行。如果有人的举动“一反常态”，我们会立刻察觉并做出恰当回应。而且，当“我们自己”举止反常时，我们也能很快察觉，并立即加以约束。</w:t>
+        <w:t xml:space="preserve">从上述三类或其更宽泛的分类出发，去了解生活中的人，是很有帮助的。这能让我们更准确地读懂他们，避免误解他们的言行。如果有人的举动“一反常态”，我们会立刻察觉并做出恰当回应。而且，当“我们自己”举止反常时，我们也能很快察觉，并立即加以约束。</w:t>
       </w:r>
     </w:p>
     <w:p>
@@ -3346,19 +3345,19 @@
         <w:rPr>
           <w:rFonts w:ascii="SimSun" w:cs="SimSun" w:eastAsia="SimSun" w:hAnsi="SimSun"/>
         </w:rPr>
-        <w:t xml:space="preserve">我的一位挚友“疯僧”（Mad Monk）用四十年时间侍奉了三位上师：Chatrul Rinpoche、Trulshik Rinpoche 和 Dilgo Khyentse Rinpoche。Chatrul Rinpoche 威猛、冷峻、不讲情面，而 Dilgo Rinpoche 和 Trulshik Rinpoche 则温顺得像小猫。我这位朋友常常讲起他们的教学方式何等不同，讲他如何在岁月中学会正确回应他们各自独特的教学风格。换了别人，恐怕没有谁能跟随 Chatrul Rinpoche 并执行他的指示，而不被他那突兀严厉的教风吓退。反过来，尊贵的 Dilgo Rinpoche 和 Trulshik Rinpoche 又是那样温和，若不留心，你也许会以为他们只是待你和气，而非在以重要的方式引导你。</w:t>
-      </w:r>
-    </w:p>
-    <w:p>
-      <w:pPr>
-        <w:spacing w:after="120" w:line="340"/>
-        <w:ind w:firstLine="480"/>
-      </w:pPr>
-      <w:r>
-        <w:rPr>
-          <w:rFonts w:ascii="SimSun" w:cs="SimSun" w:eastAsia="SimSun" w:hAnsi="SimSun"/>
-        </w:rPr>
-        <w:t xml:space="preserve">“疯僧”本人温暖而柔和，却从不因 Chatrul Rinpoche 时常严厉的教导方式而慌乱。他曾随 Chatrul Rinpoche 在喜马拉雅山径上跋涉数月，看仁波切逐一探视散居于群山之间偏远洞穴和闭关小屋里的学生。他懂得仁波切的“路数”，总是在仁波切的言语中寻找深意，因为他知道，老师从不随口说话。</w:t>
+        <w:t xml:space="preserve">我的一位挚友“疯僧”（Mad Monk）用四十年时间侍奉了三位上师：恰札仁波切、楚西仁波切和顶果钦哲仁波切（Dilgo Khyentse Rinpoche）。恰札仁波切威猛、冷峻、不讲情面，而顶果钦哲仁波切和楚西仁波切则温顺得像小猫。我这位朋友常常讲起他们的教学方式何等不同，讲他如何在岁月中学会正确回应他们各自独特的教学风格。换了别人，恐怕没有谁能跟随恰札仁波切并执行他的指示，而不被他那突兀严厉的教风吓退。反过来，尊贵的顶果钦哲仁波切和楚西仁波切又是那样温和，若不留心，你也许会以为他们只是待你和气，而非在以重要的方式引导你。</w:t>
+      </w:r>
+    </w:p>
+    <w:p>
+      <w:pPr>
+        <w:spacing w:after="120" w:line="340"/>
+        <w:ind w:firstLine="480"/>
+      </w:pPr>
+      <w:r>
+        <w:rPr>
+          <w:rFonts w:ascii="SimSun" w:cs="SimSun" w:eastAsia="SimSun" w:hAnsi="SimSun"/>
+        </w:rPr>
+        <w:t xml:space="preserve">“疯僧”本人温暖而柔和，却从不因恰札仁波切时常严厉的教导方式而慌乱。他曾随恰札仁波切在喜马拉雅山径上跋涉数月，看仁波切逐一探视散居于群山之间偏远洞穴和闭关小屋里的学生。他懂得仁波切的“路数”，总是在仁波切的言语中寻找深意，因为他知道，老师从不随口说话。</w:t>
       </w:r>
     </w:p>
     <w:p>
@@ -3407,7 +3406,7 @@
         <w:rPr>
           <w:rFonts w:ascii="SimSun" w:cs="SimSun" w:eastAsia="SimSun" w:hAnsi="SimSun"/>
         </w:rPr>
-        <w:t xml:space="preserve">有投入，冥想才有可能；缺乏投入，冥想注定失败。开始一门冥想修习，或在多年修习之后改换新法，都必须伴以坚实的投入。如果我们的态度更像是“试试看”而非全心投入，那么明智得多的做法或许是干脆别下水。而一位经验丰富的修行者，自会知道何时应当坚守。尝试新事物的诱惑几乎从不伴随着投入，而誓死坚守到底的意愿则总是与投入同在。灵性修行即便进展顺利，也会有长时间看似停滞的阶段。若是缺乏耐心，用这样那样的方式给修习“加点料”的诱惑便会显得颇具吸引力。然而，我们的新点子几乎不可能不很快变得索然无味，进而带来气馁，削弱我们的修习与决心。倘若我们当初坚守阵地、咬牙撑住，如今早已让决心和修习更加坚固。</w:t>
+        <w:t xml:space="preserve">有投入，冥想才有可能；缺乏投入，冥想注定失败。开始一门冥想修习，或在多年修习之后改换新法，都必须伴以坚实的投入。如果我们的态度更像是“试试看”而非全心投入，那么明智得多的做法或许是干脆别下水。而一位经验丰富的修行者，自会知道何时应当坚守。尝试新事物的诱惑几乎从不伴随着投入，而誓死坚守到底的意愿则总是与投入同在。灵性修习即便进展顺利，也会有长时间看似停滞的阶段。若是缺乏耐心，用这样那样的方式给修习“加点料”的诱惑便会显得颇具吸引力。然而，我们的新点子几乎不可能不很快变得索然无味，进而带来气馁，削弱我们的修习与决心。倘若我们当初坚守阵地、咬牙撑住，如今早已让决心和修习更加坚固。</w:t>
       </w:r>
     </w:p>
     <w:p>
@@ -3431,7 +3430,7 @@
         <w:rPr>
           <w:rFonts w:ascii="SimSun" w:cs="SimSun" w:eastAsia="SimSun" w:hAnsi="SimSun"/>
         </w:rPr>
-        <w:t xml:space="preserve">与朋友谈谈自己的困扰能减轻负担，因为置身事外的人能给出不受牵绊的视角，往往会带来洞见。身在局中时，类似的洞见是很难获得的。阅读大师的传记，甚至研习某个与灵性无关的领域，如数学、生物学等等，都能激发心智，成为提升冥想修习的助缘。最后但同样重要的，是 Paramahansa Yogananda 的建议：放一两个星期的假。</w:t>
+        <w:t xml:space="preserve">与朋友谈谈自己的困扰能减轻负担，因为置身事外的人能给出不受牵绊的视角，往往会带来洞见。身在局中时，类似的洞见是很难获得的。阅读大师的传记，甚至研习某个与灵性无关的领域，如数学、生物学等等，都能激发心智，成为提升冥想修习的助缘。最后但同样重要的，是帕拉宏撒·尤迦南达的建议：放一两个星期的假。</w:t>
       </w:r>
     </w:p>
     <w:p>
@@ -3463,7 +3462,7 @@
         <w:rPr>
           <w:rFonts w:ascii="SimSun" w:cs="SimSun" w:eastAsia="SimSun" w:hAnsi="SimSun"/>
         </w:rPr>
-        <w:t xml:space="preserve">佛法修习与良好的营养在许多方面颇为相似。即使吃的是有营养的食物，倘若品类不全或比例失当，结果也谈不上健康。各种食物协同作用，才能保证健康；没有哪一种食物能让我们长久保持健康。佛法修习也一样，并无灵丹妙药。一门好的佛法修习包含多种“食材”，有的我们喜欢，有的则未必。通常，就像运动一样，我们倾向于练自己擅长的，对不擅长的则热情不高（甚至干脆置之不理）。偏爱某些修习本属自然，但我们必须有足够的智慧，明白那些最不受待见的修习也许恰恰是我们最需要的——正如药膳往往不合口味，却不宜忽视。我们必须了解自己的心理，并意识到那颗好恶分明的心恐怕正是我们最大的敌人。理性与分析应当凌驾于“偏好”之上，如此才能打造一门有效而均衡、足以实现我们志向的修习。</w:t>
+        <w:t xml:space="preserve">佛法修习与良好的营养在许多方面颇为相似。即使吃的是有营养的食物，倘若品类不全或比例失当，结果也谈不上健康。各种食物协同作用，才能保证健康；没有哪一种食物能让我们长久保持健康。佛法修习也一样，并无灵丹妙药。一门好的佛法修习包含多种“食材”，有的我们喜欢，有的则不然。通常，就像运动一样，我们倾向于练自己擅长的，对不擅长的则热情不高（甚至干脆置之不理）。偏爱某些修习本属自然，但我们必须有足够的智慧，明白那些最不受待见的修习也许恰恰是我们最需要的——正如药膳往往不合口味，却不宜忽视。我们必须了解自己的心理，并意识到那颗好恶分明的心恐怕正是我们最大的敌人。理性与分析应当凌驾于“偏好”之上，如此才能打造一门有效而均衡、足以实现我们志向的修习。</w:t>
       </w:r>
     </w:p>
     <w:p>
@@ -3499,7 +3498,7 @@
         <w:rPr>
           <w:rFonts w:ascii="SimSun" w:cs="SimSun" w:eastAsia="SimSun" w:hAnsi="SimSun"/>
         </w:rPr>
-        <w:t xml:space="preserve">上了年纪的读者也许还记得那则广告：“条条大路通西尔斯（Sears）。”话虽如此，这句话其实没什么意义，因为“条条”大路既通西尔斯，也通任何别的地方。但当我们的志向是认识自我时，条条大路确实都通向自我认识。心的本性本自光明，这意味着只要我们让心朝向那个方向，就必然会找到它。</w:t>
+        <w:t xml:space="preserve">上了年纪的读者也许还记得那则广告：“条条大路通西尔斯（Sears）。”话虽如此，这句话其实没什么意义，因为“条条”大路既通西尔斯，也通任何别的地方。但当我们的志向是认识自我时，条条大路确实都通向自我认识。心性本自光明，这意味着只要我们让心朝向那个方向，就必然会找到它。</w:t>
       </w:r>
     </w:p>
     <w:p>
@@ -3567,7 +3566,7 @@
         <w:rPr>
           <w:rFonts w:ascii="SimSun" w:cs="SimSun" w:eastAsia="SimSun" w:hAnsi="SimSun"/>
         </w:rPr>
-        <w:t xml:space="preserve">一般而言，一个好的起点，是从某位觉悟大师对传统典籍的释论入手。这些释论可能已有数百年历史——五百年甚至更久——而它们本身又可能是对更早释论的再释，同样出自觉悟大师之手。就传承而言，典籍与释论多种多样，代表着不同的哲学见地与思想流派，可能还连带着与之相应的不同冥想技巧。之所以有这么多样式，是因为每个人对不同的激发因缘反应各异；选择越多，找到合适之法的几率就越大。同样，古老的传承也反映了历代大师为达成同一目标所采用的不同路径。</w:t>
+        <w:t xml:space="preserve">一般而言，一个好的起点，是从某位开悟大师对传统典籍的释论入手。这些释论可能已有数百年历史——五百年甚至更久——而它们本身又可能是对更早释论的再释，同样出自开悟大师之手。就传承而言，典籍与释论多种多样，代表着不同的哲学见地与思想流派，可能还连带着与之相应的不同冥想技巧。之所以有这么多样式，是因为每个人对不同刺激的反应各不相同；选择越多，找到合适之法的几率就越大。同样，古老的传承也反映了历代大师为达成同一目标所采用的不同路径。</w:t>
       </w:r>
     </w:p>
     <w:p>
@@ -3648,7 +3647,7 @@
         <w:rPr>
           <w:rFonts w:ascii="SimSun" w:cs="SimSun" w:eastAsia="SimSun" w:hAnsi="SimSun"/>
         </w:rPr>
-        <w:t xml:space="preserve">给我们心中的阴影以恰当的曝光，也许并不令人愉快，但总好过让一幅粉饰过的自我画像占据冥想的背景。遗憾的是，人的天性总希望在最好的光线下看待自己；然而，作为冥想标志的平等心，却是一幅对我们毫无偏倚的画像，冥想正是从这幅画像中提炼出来的。与冥想同时呈现的自我影像必须未经修饰，否则我们的冥想就会受损。这两个世界同时并存，无论我们是否察觉，彼此都在相互影响。</w:t>
+        <w:t xml:space="preserve">给我们心中的阴影以恰当的曝光，也许并不令人愉快，但总好过让一幅粉饰过的自我画像占据冥想的背景。遗憾的是，人的天性总希望在最好的光线下看待自己；然而，平等心——冥想的标志——却是一幅对我们毫无偏倚的画像，冥想正是从这幅画像中提炼出来的。与冥想同时呈现的自我影像必须未经修饰，否则我们的冥想就会受损。这两个世界同时并存，无论我们是否察觉，彼此都在相互影响。</w:t>
       </w:r>
     </w:p>
     <w:p>
@@ -3672,19 +3671,19 @@
         <w:rPr>
           <w:rFonts w:ascii="SimSun" w:cs="SimSun" w:eastAsia="SimSun" w:hAnsi="SimSun"/>
         </w:rPr>
-        <w:t xml:space="preserve">冥想是乏味还是引人入胜，取决于我们如何对待它。初学者通常会任由自己飘入愉悦的心理放纵，以此逃避冥想中乏味的部分，与此同时仍让持咒、呼吸正念或其他冥想技巧维持运转。既然冥想技巧还在维持、没有丢失，他也许便以为一切都好。他很可能心知肚明，却不肯对自己承认，唯恐这会让整个修习受到质疑。对他来说，“摇晃这条船”绝不在考虑之列。</w:t>
-      </w:r>
-    </w:p>
-    <w:p>
-      <w:pPr>
-        <w:spacing w:after="120" w:line="340"/>
-        <w:ind w:firstLine="480"/>
-      </w:pPr>
-      <w:r>
-        <w:rPr>
-          <w:rFonts w:ascii="SimSun" w:cs="SimSun" w:eastAsia="SimSun" w:hAnsi="SimSun"/>
-        </w:rPr>
-        <w:t xml:space="preserve">然而，身为冥想者，无论初学还是资深，我们都必须明白：冥想终究会“摇晃这条船”。自满是冥想常见的障碍，资深冥想者与初学者同样容易陷入。资深修习者也许达到了能够“沉醉于极乐”的技巧水平，但这并不一定意味着在前进。他辛辛苦苦才走到今天，也许对现状颇为满足，不愿继续走向道路要引领他去的地方。相反，他会任性地沉溺于一次次充满喜乐的冥想，即使明知这样做会断送进一步的提升。这种诱惑是如此常见的陷阱，以致《楞严经》用最后四分之一的篇幅来解说需要警惕的种种征兆，以及避免执著于喜乐觉知状态的重要性。</w:t>
+        <w:t xml:space="preserve">冥想是乏味还是引人入胜，取决于我们如何对待它。初学者通常会任由自己飘入愉悦的心理放纵，以此逃避冥想中乏味的部分，与此同时仍让持咒、观呼吸或其他冥想技巧维持运转。既然冥想技巧还在维持、没有丢失，他也许便以为一切都好。他很可能心知肚明，却不肯对自己承认，唯恐这会让整个修习受到质疑。对他来说，“摇晃这条船”绝不在考虑之列。</w:t>
+      </w:r>
+    </w:p>
+    <w:p>
+      <w:pPr>
+        <w:spacing w:after="120" w:line="340"/>
+        <w:ind w:firstLine="480"/>
+      </w:pPr>
+      <w:r>
+        <w:rPr>
+          <w:rFonts w:ascii="SimSun" w:cs="SimSun" w:eastAsia="SimSun" w:hAnsi="SimSun"/>
+        </w:rPr>
+        <w:t xml:space="preserve">然而，身为冥想者，无论初学还是资深，我们都必须明白：冥想终究会“摇晃这条船”。自满是冥想常见的障碍，资深冥想者与初学者同样容易陷入。资深修行者也许达到了能够“沉醉于喜乐”的技巧水平，但这并不一定意味着在前进。他辛辛苦苦才走到今天，也许对现状颇为满足，不愿继续走向道路要引领他去的地方。相反，他会任性地沉溺于一次次充满喜乐的冥想，即使明知这样做会断送进一步的提升。这种诱惑是如此常见的陷阱，以致《楞严经》用最后四分之一的篇幅来解说需要警惕的种种征兆，以及避免执着于喜乐觉知状态的重要性。</w:t>
       </w:r>
     </w:p>
     <w:p>
@@ -3800,7 +3799,7 @@
         <w:rPr>
           <w:rFonts w:ascii="SimSun" w:cs="SimSun" w:eastAsia="SimSun" w:hAnsi="SimSun"/>
         </w:rPr>
-        <w:t xml:space="preserve">如果我们难以抗拒对念头的卷入，一个不错的办法是不时中断冥想，问问自己：升起的各种念头形态都有哪些特征。像整理书架或厨房用具那样给念头分类，或者像分拣待洗衣物那样把同类归在一起，以此使念头去个人化，能帮助我们减轻潜台词的困扰。如此一来，念头自然变得不那么“私人”，我们的冥想也会更加清明。</w:t>
+        <w:t xml:space="preserve">如果我们难以抗拒对念头的卷入，一个不错的办法是不时中断冥想，问问自己：生起的各种念头形态都有哪些特征。像整理书架或厨房用具那样给念头分类，或者像分拣待洗衣物那样把同类归在一起，以此使念头去个人化，能帮助我们减轻潜台词的困扰。如此一来，念头自然变得不那么“私人”，我们的冥想也会更加清明。</w:t>
       </w:r>
     </w:p>
     <w:p>
@@ -3904,7 +3903,7 @@
         <w:rPr>
           <w:rFonts w:ascii="SimSun" w:cs="SimSun" w:eastAsia="SimSun" w:hAnsi="SimSun"/>
         </w:rPr>
-        <w:t xml:space="preserve">身为人类，我们的问题之一在于一种难以抗拒的冲动：把念头当成一项项提议，觉得必须付诸行动。我们害怕不出手干预，机会就会溜走。至于愿望可以作为冥想的副产品得到实现、我们只需扮演旁观者的角色——这在我们看来往往不可思议。我们是会思考的存在，本不必把这一点固化为实，可我们偏偏这么做。</w:t>
+        <w:t xml:space="preserve">身为人类，我们的问题之一在于一种难以抗拒的冲动：把念头当成一项项提议，觉得必须付诸行动。我们害怕不出手干预，机会就会溜走。至于愿望可以作为冥想的副产品得到实现、我们只需扮演旁观者的角色——这在我们看来往往不可思议。我们是会思考的存在，本不必把这一点执为实有，可我们偏偏这么做。</w:t>
       </w:r>
     </w:p>
     <w:p>
@@ -3952,7 +3951,7 @@
         <w:rPr>
           <w:rFonts w:ascii="SimSun" w:cs="SimSun" w:eastAsia="SimSun" w:hAnsi="SimSun"/>
         </w:rPr>
-        <w:t xml:space="preserve">那些内心安宁之人有着非凡的耐心，明证就在于：他们同样尚未完成自己需要完成的一切，却对此表现得全然不急不躁。他们知道自己的船终会靠岸，也不在意那是什么时候。此外，他们对弟子种种弱点的包容，堪称对“耐心”最高的礼赞。</w:t>
+        <w:t xml:space="preserve">那些内心安宁之人有着非凡的耐心，明证就在于：他们同样尚未完成自己需要完成的一切，却对此表现得全然不急不躁。他们知道自己的船终会靠岸，也不在意那是什么时候。此外，他们对弟子种种弱点的包容，本身就是对“要有耐心”再有力不过的劝勉。</w:t>
       </w:r>
     </w:p>
     <w:p>
@@ -4088,7 +4087,7 @@
         <w:rPr>
           <w:rFonts w:ascii="SimSun" w:cs="SimSun" w:eastAsia="SimSun" w:hAnsi="SimSun"/>
         </w:rPr>
-        <w:t xml:space="preserve">佛教哲学的突出特点之一是其实用性。它不立神祇，脚踏实地。佛教几乎不给形而上学的玄想留有余地，而是立足于理性。就连它对“罪”的态度也是理性的：它不宣讲造物主的定罪惩罚，而是强调我们以自己的行为造出自己的地狱或天堂，同样也因自己之手而受苦。一切皆是自作，而非天命所定。我们睡的床是自己铺的，被角也是自己掖的。</w:t>
+        <w:t xml:space="preserve">佛教哲学的突出特点之一是其实用性。它是非有神论的，而且脚踏实地。佛教几乎不给形而上学的玄想留有余地，而是立足于理性。就连它对“罪”的态度也是理性的：它不宣讲造物主的定罪惩罚，而是强调我们以自己的行为造出自己的地狱或天堂，同样也因自己之手而受苦。一切皆是自作，而非天命所定。我们睡的床是自己铺的，被角也是自己掖的。</w:t>
       </w:r>
     </w:p>
     <w:p>
@@ -4124,7 +4123,7 @@
         <w:rPr>
           <w:rFonts w:ascii="SimSun" w:cs="SimSun" w:eastAsia="SimSun" w:hAnsi="SimSun"/>
         </w:rPr>
-        <w:t xml:space="preserve">在公开场合，我们的长处应当好好藏起，短处则不妨示人。对自己的短处不遮遮掩掩，是超越它们的最佳疗法。这能把短处转化为长处，并卸下我们的负担。这也许并不愉快，但让别人消化我们的过失，将使我们受益匪浅。他人的洞见，即使未曾说出口，也可能照亮我们心中的角落，把先前隐藏的一切显露出来。念头是长着翅膀的。反过来也一样，只是除非我们的朋友熟悉佛教的“坦诚开放”，否则我们多半只能看到一场深思熟虑的公开表演。</w:t>
+        <w:t xml:space="preserve">在公开场合，我们的长处应当好好藏起，短处则应坦然示人。对自己的短处不遮遮掩掩，是超越它们的最佳疗法。这能把短处转化为长处，并卸下我们的负担。这也许并不愉快，但让别人消化我们的过失，将使我们受益匪浅。他人的洞见，即使未曾说出口，也可能照亮我们心中的角落，把先前隐藏的一切显露出来。念头是长着翅膀的。反过来也一样，只是除非我们的朋友熟悉佛教的“坦诚开放”，否则我们多半只能看到一场深思熟虑的公开表演。</w:t>
       </w:r>
     </w:p>
     <w:p>
@@ -4148,7 +4147,7 @@
         <w:rPr>
           <w:rFonts w:ascii="SimSun" w:cs="SimSun" w:eastAsia="SimSun" w:hAnsi="SimSun"/>
         </w:rPr>
-        <w:t xml:space="preserve">法道应尽量保持简单，这是一条永恒的常理。无论是我们研习的哲学体系、修习的冥想，还是我们的生活方式，简单都能确保我们以最少的牵绊达成目标。修行人没有理由不吃简单、易做而有营养的食物。所穿的衣物不必引人注目，足以应付天气、朴素无奇即可。我们的一切物质所需都应从简满足，以支持整体的精神求索。我们的生活方式不应招人艳羡。</w:t>
+        <w:t xml:space="preserve">法道应尽量保持简单，这是一条永恒的常理。无论是我们研习的哲学体系、修习的冥想，还是我们的生活方式，简单都能确保我们以最少的牵绊达成目标。佛法修行者没有理由不吃简单、易做而有营养的食物。所穿的衣物不必引人注目，足以应付天气、朴素无奇即可。我们的一切物质所需都应从简满足，以支持整体的精神求索。我们的生活方式不应招人艳羡。</w:t>
       </w:r>
     </w:p>
     <w:p>
@@ -4216,7 +4215,7 @@
         <w:rPr>
           <w:rFonts w:ascii="SimSun" w:cs="SimSun" w:eastAsia="SimSun" w:hAnsi="SimSun"/>
         </w:rPr>
-        <w:t xml:space="preserve">我们每个人都有独特的历史，正是这些历史塑造了我们各自的样子。这些历史有高点、有中点、也有低点。冥想时，这些历史会变得更加清晰，而它们对我们的影响是积极还是消极，取决于历史本身的内容。冥想映照我们的历史，就像镜子映照面前的脸。我们的难处也许在于：能否不带执著地看向这面心灵之镜，把镜中所见当作原始数据，不评判其好坏。必须让冥想主题在不受干扰的情况下处理这些信息。这样做正合于那句著名的佛家格言——“让心不落入个别事相的领域”。</w:t>
+        <w:t xml:space="preserve">我们每个人都有独特的历史，正是这些历史塑造了我们各自的样子。这些历史有高点、有中点、也有低点。冥想时，这些历史会变得更加清晰，而它们对我们的影响是积极还是消极，取决于历史本身的内容。冥想映照我们的历史，就像镜子映照面前的脸。我们的难处也许在于：能否不带执着地看向这面心灵之镜，把镜中所见当作原始数据，不评判其好坏。必须让冥想主题在不受干扰的情况下处理这些信息。这样做正合于那句著名的佛家格言——“让心不落入个别事相的领域”。</w:t>
       </w:r>
     </w:p>
     <w:p>
@@ -4240,7 +4239,7 @@
         <w:rPr>
           <w:rFonts w:ascii="SimSun" w:cs="SimSun" w:eastAsia="SimSun" w:hAnsi="SimSun"/>
         </w:rPr>
-        <w:t xml:space="preserve">遗憾的是，概念推衍常见而非罕见，这正是冥想的努力常常失败的原因。为什么我们宁愿追随游荡的心，也不肯把注意力放在冥想主题上？例子俯拾即是。简短的回答是：心就像一头吃草的牛，不愿被拴在木桩上。即便去看那些不冥想、甚至也许从未听说过这个词的人，我们也会注意到那种任性分心的强烈倾向。无论是在上班、接孩子放学、参加家长会、坐在教室里，还是坐在冲浪板上，我们的心都在四处飘荡，而我们一路尾随。游荡是心的天性；停留于未觉悟，同样是心的天性。</w:t>
+        <w:t xml:space="preserve">遗憾的是，概念推衍常见而非罕见，这正是冥想的努力常常失败的原因。为什么我们宁愿追随游荡的心，也不肯把注意力放在冥想主题上？例子俯拾即是。简短的回答是：心就像一头吃草的牛，不愿被拴在木桩上。即便去看那些不冥想、甚至也许从未听说过这个词的人，我们也会注意到那种任性分心的强烈倾向。无论是在上班、接孩子放学、参加家长会、坐在教室里，还是坐在冲浪板上，我们的心都在四处飘荡，而我们一路尾随。游荡是心的天性；停留在未开悟的状态，同样是心的天性。</w:t>
       </w:r>
     </w:p>
     <w:p>
@@ -4312,7 +4311,7 @@
         <w:rPr>
           <w:rFonts w:ascii="SimSun" w:cs="SimSun" w:eastAsia="SimSun" w:hAnsi="SimSun"/>
         </w:rPr>
-        <w:t xml:space="preserve">当我们紧盯冥想的目标而非冥想的过程时，许多问题便被我们招来。如果不以“目标”为导向，而以“道路”为驱动，我们就会具备冥想所需的正确态度。“目标”驱动的问题，很大程度上源于社会对我们思维方式的塑造。我们的文化强调结果。“人们更可能问你‘你的工作挣多少钱’，而不是‘你喜欢你的工作吗’。”在体育运动中，人们更关心谁赢了，而不是比赛本身。我们对成就想得多，对通往成就的道路想得少。</w:t>
+        <w:t xml:space="preserve">当我们紧盯冥想的目标而非冥想的过程时，便会给自己招来许多问题。如果不以“目标”为导向，而以“道路”为驱动，我们就会具备冥想所需的正确态度。“目标”驱动的问题，很大程度上源于社会对我们思维方式的塑造。我们的文化强调结果。“人们更可能问你‘你的工作挣多少钱’，而不是‘你喜欢你的工作吗’。”在体育运动中，人们更关心谁赢了，而不是比赛本身。我们对成就想得多，对通往成就的道路想得少。</w:t>
       </w:r>
     </w:p>
     <w:p>
@@ -4392,31 +4391,31 @@
         <w:rPr>
           <w:rFonts w:ascii="SimSun" w:cs="SimSun" w:eastAsia="SimSun" w:hAnsi="SimSun"/>
         </w:rPr>
-        <w:t xml:space="preserve">在冥想的语境中，我们听说过“顿”“渐”二派，它们与稳健型股票交易者和押注高风险股票者之间可以找到相似之处。这一类比虽需细加斟酌，但确实，贪婪驱使许多人追求速成（“顿悟”），正如贪婪驱使人进行高风险投资一样。放到冥想的语境里，这可能表现为一个冥想者尚未沉浸于基础修行和学习，就先去修习密续（Tantra）或其他“顿门”法门。有人成功了，但更多人失败了；而一旦失败，他们摔得很重，重新起步时的境况比当初还要糟。</w:t>
-      </w:r>
-    </w:p>
-    <w:p>
-      <w:pPr>
-        <w:spacing w:after="120" w:line="340"/>
-        <w:ind w:firstLine="480"/>
-      </w:pPr>
-      <w:r>
-        <w:rPr>
-          <w:rFonts w:ascii="SimSun" w:cs="SimSun" w:eastAsia="SimSun" w:hAnsi="SimSun"/>
-        </w:rPr>
-        <w:t xml:space="preserve">股市老手一眼就能认出哪个交易者正走在崩盘的路上；同样，深谙冥想之道的人也总能一眼认出被贪婪驱动的灵性求道者。种种迹象再明显不过。一头扎进冥想却无视前期功课的人，永远达不成自己的愿望。</w:t>
-      </w:r>
-    </w:p>
-    <w:p>
-      <w:pPr>
-        <w:spacing w:after="120" w:line="340"/>
-        <w:ind w:firstLine="480"/>
-      </w:pPr>
-      <w:r>
-        <w:rPr>
-          <w:rFonts w:ascii="SimSun" w:cs="SimSun" w:eastAsia="SimSun" w:hAnsi="SimSun"/>
-        </w:rPr>
-        <w:t xml:space="preserve">大多数股票玩家起步时采取稳健策略，冥想者却并非如此——他们大多一上来就修习密续、金刚乘（Vajrayana）或大手印（Mahamudra）这类高风险法门，而不曾熟悉基础典籍，也不曾培养道德、慈悲与布施之心。我执驱使人们在冥想修习中一味追求目标，部分原因是他们没有什么可失去的（至少他们自以为如此）。这与贪婪的股票玩家没有两样——他愿意把钱押在高风险高回报的股票上；因为贪婪，他什么险都敢冒。同样，贪婪的冥想者不把自己的时间和精力看作可以计量的东西，愿意在尚未完成基础功课之前，就把时间投在金刚乘之类“光鲜诱人”的冥想技巧上。</w:t>
+        <w:t xml:space="preserve">在冥想的语境中，我们听说过顿门与渐门，二者与稳健型股票交易者和押注高风险股票者之间可以找到相似之处。这一类比虽需细加斟酌，但确实，贪婪驱使许多人追求速成（“顿悟”），正如贪婪驱使人进行高风险投资一样。放到冥想的语境里，这可能表现为一个冥想者尚未沉浸于基础修行和学习，就先去修习密法（Tantra）或其他“顿门”法门。有人成功了，但更多人失败了；而一旦失败，他们摔得很重，重新起步时的境况比当初还要糟。</w:t>
+      </w:r>
+    </w:p>
+    <w:p>
+      <w:pPr>
+        <w:spacing w:after="120" w:line="340"/>
+        <w:ind w:firstLine="480"/>
+      </w:pPr>
+      <w:r>
+        <w:rPr>
+          <w:rFonts w:ascii="SimSun" w:cs="SimSun" w:eastAsia="SimSun" w:hAnsi="SimSun"/>
+        </w:rPr>
+        <w:t xml:space="preserve">股市老手一眼就能认出哪个交易者正走在崩盘的路上；同样，深谙冥想之道的人也总能一眼认出被贪婪驱动的灵性求道者。种种迹象再明显不过。一头扎进冥想却无视前行功课的人，永远达不成自己的愿望。</w:t>
+      </w:r>
+    </w:p>
+    <w:p>
+      <w:pPr>
+        <w:spacing w:after="120" w:line="340"/>
+        <w:ind w:firstLine="480"/>
+      </w:pPr>
+      <w:r>
+        <w:rPr>
+          <w:rFonts w:ascii="SimSun" w:cs="SimSun" w:eastAsia="SimSun" w:hAnsi="SimSun"/>
+        </w:rPr>
+        <w:t xml:space="preserve">大多数股票玩家起步时采取稳健策略，冥想者却并非如此——他们大多一上来就修习密法、金刚乘（Vajrayana）或大手印（Mahamudra）这类高风险法门，而不曾熟悉基础典籍，也不曾培养道德、慈悲与布施之心。我执驱使人们在冥想修习中一味追求目标，部分原因是他们没有什么可失去的（至少他们自以为如此）。这与贪婪的股票玩家没有两样——他愿意把钱押在高风险高回报的股票上；因为贪婪，他什么险都敢冒。同样，贪婪的冥想者不把自己的时间和精力看作可以计量的东西，愿意在尚未完成基础功课之前，就把时间投在金刚乘之类“光鲜诱人”的冥想技巧上。</w:t>
       </w:r>
     </w:p>
     <w:p>
@@ -4520,7 +4519,7 @@
         <w:rPr>
           <w:rFonts w:ascii="SimSun" w:cs="SimSun" w:eastAsia="SimSun" w:hAnsi="SimSun"/>
         </w:rPr>
-        <w:t xml:space="preserve">冥想修习常常因境遇变迁而衰退。我们应当警惕任由此事发生的倾向。在搬迁、转行、婚姻状况变化、结识新朋友等种种人生变动中维持一份自律的冥想修习并不容易。新环境可能带来社交上的变化，人们的习惯对我们来说是陌生的；对于不太外向的人，新的相识可能令人生畏。但变化总是需要调适的，它是积极的，绝不应使我们对自己或修习失去信心。如果信仰不为对方所共有，婚姻可能招致新伴侣的敌意。配偶可能感到彼此错位、受到冷落，进而嫉妒、怨怼——这些本可以通过在关系之初的耐心沟通来避免。时间自会把一切理顺。永远不要为自己或自己的冥想修习辩护，因为那是软弱的表现，会被人抓住不放。</w:t>
+        <w:t xml:space="preserve">冥想修习常常因境遇变迁而衰退。我们应当警惕任由此事发生的倾向。在搬迁、转行、婚姻状况变化、结识新朋友等种种人生变动中维持一份自律的冥想修习并不容易。新环境可能带来社交上的变化，人们的习惯对我们来说是陌生的；对于不太外向的人，新的相识可能令人生畏。但变化总是需要调适的，它是积极的，绝不应使我们对自己或修习失去信心。如果新伴侣与我们没有共同的信仰，婚姻可能招致对方的敌意。配偶可能感到彼此错位、受到冷落，进而嫉妒、怨怼——这些本可以通过在关系之初的耐心沟通来避免。时间自会把一切理顺。永远不要为自己或自己的冥想修习辩护，因为那是软弱的表现，会被人抓住不放。</w:t>
       </w:r>
     </w:p>
     <w:p>
@@ -4544,7 +4543,7 @@
         <w:rPr>
           <w:rFonts w:ascii="SimSun" w:cs="SimSun" w:eastAsia="SimSun" w:hAnsi="SimSun"/>
         </w:rPr>
-        <w:t xml:space="preserve">前面谈到的股票交易者中，稳健型的那些也面临类似的问题。有时，一只缓慢上行的股票会突然下挫，他们的投资组合可能损失惨重；但因为身经百战，他们稳住不动。他们知道，惊慌失措的人往往会错过必然到来的反弹。历练有素的冥想者也是如此。如果修习变得不稳定，他们不会让自己心烦意乱。他们知道过程会自行修正，而任何对永恒稳定的期待都纯属不切实际。</w:t>
+        <w:t xml:space="preserve">前面谈到的股票交易者中，稳健型的那些也面临类似的问题。有时，一只缓慢上行的股票会突然下挫，他们的投资组合可能损失不小；但因为身经百战，他们稳住不动。他们知道，惊慌失措的人往往会错过必然到来的反弹。历练有素的冥想者也是如此。如果修习变得不稳定，他们不会让自己心烦意乱。他们知道过程会自行修正，而任何对永恒稳定的期待都纯属不切实际。</w:t>
       </w:r>
     </w:p>
     <w:p>
@@ -4612,7 +4611,7 @@
         <w:rPr>
           <w:rFonts w:ascii="SimSun" w:cs="SimSun" w:eastAsia="SimSun" w:hAnsi="SimSun"/>
         </w:rPr>
-        <w:t xml:space="preserve">这一问题的根源，往往是把专注误当成冥想，付出相当努力却不见结果，于是心生挫败。这种挫败导致冲动而轻率的行为——为了见效，我们什么都愿意试。我们买来闻所未闻的传统的书籍，四处寻访老师和讲者，只求尽量多地吞下东西，却不肯花必要的时间去考察源头。而且，即便来源都是好的，由于各传统在关键哲学观点和冥想方法程序上互有差异，我们也可能被它们表面上的矛盾弄得一头雾水。简言之，即使一锅汤的所有食材都是好的，如果彼此不搭，这锅汤也做不成。</w:t>
+        <w:t xml:space="preserve">这一问题的根源，往往是把专注误当成冥想，付出相当努力却不见结果，于是心生挫败。这种挫败导致冲动而轻率的行为——为了见效，我们什么都愿意试。我们买来闻所未闻的传统的书籍，四处寻访老师和讲者，只求尽量多地吞下东西，却不肯花必要的时间去考察源头。而且，即便来源都是好的，由于各传统在关键哲学观点和冥想方法程序上互有差异，我们也可能被它们表面上的矛盾弄得一头雾水。简言之，即使一锅汤的所有食材都是好的，如果彼此不搭，这锅汤也会做砸。</w:t>
       </w:r>
     </w:p>
     <w:p>
@@ -4648,19 +4647,19 @@
         <w:rPr>
           <w:rFonts w:ascii="SimSun" w:cs="SimSun" w:eastAsia="SimSun" w:hAnsi="SimSun"/>
         </w:rPr>
-        <w:t xml:space="preserve">重要的是确认这位老师代表佛教的主要法脉，而不是打着“佛教”旗号自辟蹊径。要确认这位老师讲解的是真实的经典（sutras），并且自认属于禅宗（Chan）、日本禅（Zen）、噶举派、大圆满、格鲁派，或其他佛教哲学体系主要分支中的一支。这一点怎么强调都不为过，因为知道自己认同哪种佛教修行形式，能帮你收窄主要研习的范围，确保修行不致散乱、精力不致耗散。</w:t>
-      </w:r>
-    </w:p>
-    <w:p>
-      <w:pPr>
-        <w:spacing w:after="120" w:line="340"/>
-        <w:ind w:firstLine="480"/>
-      </w:pPr>
-      <w:r>
-        <w:rPr>
-          <w:rFonts w:ascii="SimSun" w:cs="SimSun" w:eastAsia="SimSun" w:hAnsi="SimSun"/>
-        </w:rPr>
-        <w:t xml:space="preserve">就连高阶的冥想者也会更换法脉。他们之所以如此，是因为尽管曾对某一法脉有强烈的认同，修行也一直在该法脉中进行，但随着时间推移，他们可能被沿途接触到的其他教法打动，觉得另一体系的哲学立场更贴近自己的信念，于是改宗那个传统。这从来不是因为朝三暮四，而是出于扎根在个人灵性成长中的充分理由。作为初学者，我们应当坚守自己已经承诺的选择，除非发现了老师或僧伽先前隐藏的问题。我们也可能通过自学发现，所受的教导与它声称代表的经典并不相符——这就是“弃船”另寻他处的正当理由。</w:t>
+        <w:t xml:space="preserve">重要的是确认这位老师代表佛教的主要传承，而不是打着“佛教”旗号自辟蹊径。要确认这位老师讲解的是真实的经典（sutras），并且自认属于禅宗（Chan）、日本禅（Zen）、噶举派、大圆满、格鲁派，或其他佛教哲学体系主要分支中的一支。这一点怎么强调都不为过，因为知道自己认同哪种佛教修行形式，能帮你收窄主要研习的范围，确保修行不致散乱、精力不致耗散。</w:t>
+      </w:r>
+    </w:p>
+    <w:p>
+      <w:pPr>
+        <w:spacing w:after="120" w:line="340"/>
+        <w:ind w:firstLine="480"/>
+      </w:pPr>
+      <w:r>
+        <w:rPr>
+          <w:rFonts w:ascii="SimSun" w:cs="SimSun" w:eastAsia="SimSun" w:hAnsi="SimSun"/>
+        </w:rPr>
+        <w:t xml:space="preserve">就连高阶的冥想者也会更换传承。他们之所以如此，是因为尽管曾对某一传承有强烈的认同，修行也一直在该传承中进行，但随着时间推移，他们可能被沿途接触到的其他教法打动，觉得另一体系的哲学立场更贴近自己的信念，于是改宗那个传统。这从来不是因为朝三暮四，而是出于扎根在个人灵性成长中的充分理由。作为初学者，我们应当坚守自己已经承诺的选择，除非发现了老师或僧伽（sangha）先前隐藏的问题。我们也可能通过自学发现，所受的教导与它声称代表的经典并不相符——这就是“弃船”另寻他处的正当理由。</w:t>
       </w:r>
     </w:p>
     <w:p>
@@ -4684,7 +4683,7 @@
         <w:rPr>
           <w:rFonts w:ascii="SimSun" w:cs="SimSun" w:eastAsia="SimSun" w:hAnsi="SimSun"/>
         </w:rPr>
-        <w:t xml:space="preserve">佛教的各个法脉是一个个思想流派，要理解它们，我们必须先透彻熟悉自己所选定的传统。透彻理解了一家立场，我们才有条件去理解其他各家；而若连一家都未曾参透，其他各家必然遥不可及。诸体系终将殊途同归，但若不先托身其一，我们就别指望抵达那里。</w:t>
+        <w:t xml:space="preserve">佛教的各个传承是一个个思想流派，要理解它们，我们必须先透彻熟悉自己所选定的传统。透彻理解了一家立场，我们才有条件去理解其他各家；而若连一家都未曾参透，其他各家必然遥不可及。诸体系终将殊途同归，但若不先托身其一，我们就别指望抵达那里。</w:t>
       </w:r>
     </w:p>
     <w:p>
@@ -4740,7 +4739,7 @@
         <w:rPr>
           <w:rFonts w:ascii="SimSun" w:cs="SimSun" w:eastAsia="SimSun" w:hAnsi="SimSun"/>
         </w:rPr>
-        <w:t xml:space="preserve">我们更倾向的，究竟是推理与分析，还是抽象思维、对真理的预想，而非科学式的考察？做出正确选择，靠的不是挑选最高深的体系，而是选择最契合我们性情的那一个。</w:t>
+        <w:t xml:space="preserve">我们是否更倾向于推理与分析、抽象思维与对真理的预想，而非科学式的考察？做出正确选择，靠的不是挑选最高深的体系，而是选择最契合我们性情的那一个。</w:t>
       </w:r>
     </w:p>
     <w:p>
@@ -4776,7 +4775,7 @@
         <w:rPr>
           <w:rFonts w:ascii="SimSun" w:cs="SimSun" w:eastAsia="SimSun" w:hAnsi="SimSun"/>
         </w:rPr>
-        <w:t xml:space="preserve">如果你请一位实在论者定义爱情，他也许会引用词典里的某个条目，这能让我们许多人满意。如果你去问一个爱做梦的人，他的回答也许会像奥斯卡·汉默斯坦（Oscar Hammerstein）那首歌里唱的：“谁能解释它，谁又能试着解释？愚人会给你种种理由，智者从不去试。”两种解释都可以令人满足，但不太可能让所有人都满足。</w:t>
+        <w:t xml:space="preserve">如果你请一位现实型的人定义爱情，他也许会引用词典里的某个条目，这能让我们许多人满意。如果你去问一个爱做梦的人，他的回答也许会像奥斯卡·汉默斯坦（Oscar Hammerstein）那首歌里唱的：“谁能解释它，谁又能试着解释？愚人会给你种种理由，智者从不去试。”两种解释都可以令人满足，但不太可能让所有人都满足。</w:t>
       </w:r>
     </w:p>
     <w:p>
@@ -4844,19 +4843,19 @@
         <w:rPr>
           <w:rFonts w:ascii="SimSun" w:cs="SimSun" w:eastAsia="SimSun" w:hAnsi="SimSun"/>
         </w:rPr>
-        <w:t xml:space="preserve">摄影大师 Ansel Adams 说过：“机遇偏爱有准备的头脑。”直觉亦然。散漫的态度对冥想无用，迫切感才有用。禅门有言：“迟疑者失之。”尽管很少有人想到，“顿悟”背后其实有大量的铺垫功夫。然而许多人相信，每天在禅堂里对着一面空墙、揣着一颗空白的心枯坐几个小时，就能招来奇迹。迫切感在，奇迹就会来；迫切感不在，就不会来。所以，真正的问题应当是如何培养坚定而持久的心态，而不是如何在佛殿里一坐几个小时。培养迫切感，意味着培养一种除去自身障碍的、永不餍足的渴求；这是一段个人的旅程，需要坚定的投入。除了我们自己，没有人知道我们的执著藏在哪里，也没有任何一本书能告诉我们该舍弃什么。我们只能知道：贪婪、贪爱、对事物的渴求是障碍；至于那些“事物”具体是什么，书本里找不到。我们必须对自己诚实，才能知道箭该射向何处。</w:t>
-      </w:r>
-    </w:p>
-    <w:p>
-      <w:pPr>
-        <w:spacing w:after="120" w:line="340"/>
-        <w:ind w:firstLine="480"/>
-      </w:pPr>
-      <w:r>
-        <w:rPr>
-          <w:rFonts w:ascii="SimSun" w:cs="SimSun" w:eastAsia="SimSun" w:hAnsi="SimSun"/>
-        </w:rPr>
-        <w:t xml:space="preserve">我们在寺院中面对的那面墙，就像一面镜子，映出我们离开冥想坐垫后所要面对的重重障碍之墙。若认不清这一点，再多的冥想也帮不了我们。禅堂里的进步，与我们识别自己生活中“漏”（outflows）的能力成正比——那些我们乐在其中、看似无伤大雅的放纵，却会滋生贪爱与执著，从而限制我们在冥想中保持开放、易于领受的能力。</w:t>
+        <w:t xml:space="preserve">摄影大师 Ansel Adams 说过：“机遇偏爱有准备的头脑。”直觉亦然。散漫的态度对冥想无用，迫切感才有用。禅门有言：“迟疑者失之。”尽管很少有人想到，“顿悟”背后其实有大量的铺垫功夫。然而许多人相信，每天在禅堂里对着一面空墙、揣着一颗空白的心枯坐几个小时，就能招来奇迹。迫切感在，奇迹就会来；迫切感不在，就不会来。所以，真正的问题应当是如何培养坚定而持久的心态，而不是如何在佛殿里一坐几个小时。培养迫切感，意味着培养一种除去自身障碍的、永不餍足的渴求；这是一段个人的旅程，需要坚定的投入。除了我们自己，没有人知道我们的执着藏在哪里，也没有任何一本书能告诉我们该舍弃什么。我们只能知道：贪婪、贪爱、对事物的渴求是障碍；至于那些“事物”具体是什么，书本里找不到。我们必须对自己诚实，才能知道箭该射向何处。</w:t>
+      </w:r>
+    </w:p>
+    <w:p>
+      <w:pPr>
+        <w:spacing w:after="120" w:line="340"/>
+        <w:ind w:firstLine="480"/>
+      </w:pPr>
+      <w:r>
+        <w:rPr>
+          <w:rFonts w:ascii="SimSun" w:cs="SimSun" w:eastAsia="SimSun" w:hAnsi="SimSun"/>
+        </w:rPr>
+        <w:t xml:space="preserve">我们在寺院中面对的那面墙，就像一面镜子，映出我们离开冥想坐垫后所要面对的重重障碍之墙。若认不清这一点，再多的冥想也帮不了我们。禅堂里的进步，与我们识别自己生活中“漏”（outflows）的能力成正比——那些我们乐在其中、看似无伤大雅的放纵，却会滋生贪爱与执着，从而限制我们在冥想中保持开放、易于领受的能力。</w:t>
       </w:r>
     </w:p>
     <w:p>
@@ -4880,7 +4879,7 @@
         <w:rPr>
           <w:rFonts w:ascii="SimSun" w:cs="SimSun" w:eastAsia="SimSun" w:hAnsi="SimSun"/>
         </w:rPr>
-        <w:t xml:space="preserve">对一个真正投入的人来说，没有哪个格子能把冥想装进去。铃声响起，不过是同一件事换了一种形式继续。当我们从冥想坐垫上起身，“打影子拳”的练习就结束了。世界是我们的拳台，挑战者是我们的欲望、贪爱与执著。我们能侧身躲闪吗？能游走周旋吗？还是露出破绽，挨上冷不防的一记重拳？这个敌人十分强悍，我们必须掌握好节奏，避免那些难以为继的冲动之举。</w:t>
+        <w:t xml:space="preserve">对一个真正投入的人来说，没有哪个格子能把冥想装进去。铃声响起，不过是同一件事换了一种形式继续。当我们从冥想坐垫上起身，“打影子拳”的练习就结束了。世界是我们的拳台，挑战者是我们的欲望、贪爱与执着。我们能侧身躲闪吗？能游走周旋吗？还是露出破绽，挨上冷不防的一记重拳？这个敌人十分强悍，我们必须掌握好节奏，避免那些难以为继的冲动之举。</w:t>
       </w:r>
     </w:p>
     <w:p>
@@ -5008,7 +5007,7 @@
         <w:rPr>
           <w:rFonts w:ascii="SimSun" w:cs="SimSun" w:eastAsia="SimSun" w:hAnsi="SimSun"/>
         </w:rPr>
-        <w:t xml:space="preserve">比什么都重要的是时间。如果不肯为灵性道路投入时间，进步便无从谈起。我们不能以为一旦踏上灵性道路，障碍就会随着我们的祈愿自行消失。我们必须找出它们的源头，从源头上瓦解它们。而这只有每天投入时间才能做到；也唯有每天投入时间，才能让它成为一件乐事。三天打鱼两天晒网的修行，必然等同于苦差。</w:t>
+        <w:t xml:space="preserve">比什么都重要的是时间。如果不肯为灵性道路投入时间，进步便无从谈起。我们不能以为一旦踏上灵性道路，障碍光凭一厢情愿就会自行消失。我们必须找出它们的源头，从源头上瓦解它们。而这只有每天投入时间才能做到；也唯有每天投入时间，才能让它成为一件乐事。三天打鱼两天晒网的修行，必然等同于苦差。</w:t>
       </w:r>
     </w:p>
     <w:p>
@@ -5088,7 +5087,7 @@
         <w:rPr>
           <w:rFonts w:ascii="SimSun" w:cs="SimSun" w:eastAsia="SimSun" w:hAnsi="SimSun"/>
         </w:rPr>
-        <w:t xml:space="preserve">在冥想修习的整个历程中，我们应当保持高度的热忱、一种要不断提升冥想技能的坚定愿望、一种消化并解读复杂哲学典籍的能力，并且感到自己的修习在持续走向成熟。缺了其中任何一项，都应把它找回来。若这几样全都不在了，也许就到了认输的时候——另寻一位老师或另一个传承，重新开始。</w:t>
+        <w:t xml:space="preserve">在冥想修习的整个历程中，我们应当保持高度的热忱、一种要不断提升冥想技能的坚定愿望、一种消化并解读复杂哲学典籍的能力，并且感到自己的修习在持续走向成熟。缺了其中任何一项，都应把它找回来。若这三项全都不在了，也许就到了认输的时候——另寻一位老师或另一个传承，重新开始。</w:t>
       </w:r>
     </w:p>
     <w:p>
@@ -5112,7 +5111,7 @@
         <w:rPr>
           <w:rFonts w:ascii="SimSun" w:cs="SimSun" w:eastAsia="SimSun" w:hAnsi="SimSun"/>
         </w:rPr>
-        <w:t xml:space="preserve">当诸事顺遂时，我们很容易想当然地以为好景会一直延续。也许会，也许不会，但我们应当假定没有任何保证能让好日子一直滚滚向前，并主动作为，确保我们的佛法修行不至于走下坡路。</w:t>
+        <w:t xml:space="preserve">当诸事顺遂时，我们很容易想当然地以为好景会一直延续。也许会，也许不会，但我们应当假定好景未必长久，并主动作为，确保我们的佛法修行不至于走下坡路。</w:t>
       </w:r>
     </w:p>
     <w:p>
@@ -5148,7 +5147,7 @@
         <w:rPr>
           <w:rFonts w:ascii="SimSun" w:cs="SimSun" w:eastAsia="SimSun" w:hAnsi="SimSun"/>
         </w:rPr>
-        <w:t xml:space="preserve">由于佛教理论与实践之间有大量重叠，我们完全可能因为熟悉了另一种进路，而在自己的修行中获得突破。研究另一个体系，或许会提供一种视角，帮助我们领会一条一直与我们擦肩而过的原理——只因它这一次是以对我们奏效的方式呈现的。事实相同，呈现方式不同而已。</w:t>
+        <w:t xml:space="preserve">由于佛教各家在理论与实践上有大量重叠，我们完全可能因为熟悉了另一种进路，而在自己的修行中获得突破。研究另一个体系，或许会提供一种视角，帮助我们领会一条一直与我们擦肩而过的原理——只因它这一次是以对我们奏效的方式呈现的。事实相同，呈现方式不同而已。</w:t>
       </w:r>
     </w:p>
     <w:p>
@@ -5204,7 +5203,7 @@
         <w:rPr>
           <w:rFonts w:ascii="SimSun" w:cs="SimSun" w:eastAsia="SimSun" w:hAnsi="SimSun"/>
         </w:rPr>
-        <w:t xml:space="preserve">我们人人都盼望成功、惧怕失败。求成之愿与惧败之心，都各有需要提防的负面因素。求成之心必须由我们的理解来驾驭，否则我们就会像一辆呼啸乱窜的改装赛车，开得飞快，却不知道要去哪里。过度亢奋可能与彻底懒惰同样有害。</w:t>
+        <w:t xml:space="preserve">我们人人都盼望成功、惧怕失败。求成之愿与惧败之心，都各有需要提防的负面因素。求成之心必须由我们的理解来驾驭，否则我们就会像一辆呼啸乱窜的改装赛车，开得飞快，却不知道要去哪里。热情过度可能与彻底懒惰同样有害。</w:t>
       </w:r>
     </w:p>
     <w:p>
@@ -5228,7 +5227,7 @@
         <w:rPr>
           <w:rFonts w:ascii="SimSun" w:cs="SimSun" w:eastAsia="SimSun" w:hAnsi="SimSun"/>
         </w:rPr>
-        <w:t xml:space="preserve">过度亢奋导致粗心，粗心滋生错误，错误又迫使我们走回头路。而一个过分胆怯的人连回头路都没有——他基本上被困在原地。闯入新领域时，我们应当先熟悉其中的基本功。有些人基本功学对了，却不敢拿出来用，这是我们不想犯的错误。一旦学会了基本功，就应当立刻上手。我们会犯错，也会从错误中学习。事情本该如此。</w:t>
+        <w:t xml:space="preserve">热情过度导致粗心，粗心滋生错误，错误又迫使我们走回头路。而一个过分胆怯的人连回头路都没有——他基本上被困在原地。闯入新领域时，我们应当先熟悉其中的基本功。有些人基本功学对了，却不敢拿出来用，这是我们不想犯的错误。一旦学会了基本功，就应当立刻上手。我们会犯错，也会从错误中学习。事情本该如此。</w:t>
       </w:r>
     </w:p>
     <w:p>
@@ -5284,7 +5283,7 @@
         <w:rPr>
           <w:rFonts w:ascii="SimSun" w:cs="SimSun" w:eastAsia="SimSun" w:hAnsi="SimSun"/>
         </w:rPr>
-        <w:t xml:space="preserve">洞见与直觉有时被当作同义词，其实二者大不相同。洞见在生起之前，需要大量的铺垫。就冥想（以及大多数其他领域）而言，洞见源于一种难以餍足的渴求，而这渴求来自真诚地投入研习、思考与冥想的努力。我们可能长时间感觉像撞上了一堵墙，然后忽然破壁而出，把事情看得清清楚楚。洞见没有丝毫偶然成分，与运气毫无关系。它来自把我们不想看到的东西勾勒清楚，再经由清晰的思考将其排除。当我们把“它不是什么”检视穷尽之后，剩下的就是“它是什么”——这便是洞见。它是一种突破。</w:t>
+        <w:t xml:space="preserve">洞见与直觉有时被当作同义词，其实二者大不相同。洞见是一种产物，在它生起之前，需要大量的铺垫。就冥想（以及大多数其他领域）而言，洞见源于一种难以餍足的渴求，而这渴求来自真诚地投入研习、思考与冥想的努力。我们可能长时间感觉像撞上了一堵墙，然后忽然破壁而出，把事情看得清清楚楚。洞见没有丝毫偶然成分，与运气毫无关系。它来自把我们不想看到的东西勾勒清楚，再经由清晰的思考将其排除。当我们把“它不是什么”检视穷尽之后，剩下的就是“它是什么”——这便是洞见。它是一种突破。</w:t>
       </w:r>
     </w:p>
     <w:p>
@@ -5308,7 +5307,7 @@
         <w:rPr>
           <w:rFonts w:ascii="SimSun" w:cs="SimSun" w:eastAsia="SimSun" w:hAnsi="SimSun"/>
         </w:rPr>
-        <w:t xml:space="preserve">直觉则是无条件的、自发的，不是任何过程的产物。最好的例子见于禅宗祖师的生平，以及他们与弟子之间那些超凡而自发的往来应对。这类对答在《碧岩录》等书中记载了数以千计，绝无可能事先准备。我自己亲历的一个例子，就发生在寺院的斋堂里。</w:t>
+        <w:t xml:space="preserve">直觉则不受条件制约，自发而起，不是任何过程的产物。最好的例子见于禅宗祖师的生平，以及他们与弟子之间那些超凡而自发的往来应对。这类对答在《碧岩录》等书中记载了数以千计，绝无可能事先准备。我自己亲历的一个例子，就发生在寺院的斋堂里。</w:t>
       </w:r>
     </w:p>
     <w:p>
@@ -5356,7 +5355,7 @@
         <w:rPr>
           <w:rFonts w:ascii="SimSun" w:cs="SimSun" w:eastAsia="SimSun" w:hAnsi="SimSun"/>
         </w:rPr>
-        <w:t xml:space="preserve">上人直觉的另一个例子，是他似乎总能以他绝不可能事先计划的方式帮助学生，而且一天到晚都在这样做。比如，在佛殿里打坐几个月之后，不知何故，我对面朝东方这件事变得格外不自在。我没有转过身去，心里却浮现出一首偈子，便写下来递给上人，上面写着：“欲见西方净土阿弥陀，面朝东方如何得见？”几天过去，我把那张字条忘得一干二净，或者想着若会有回复，早就该收到了。但禅师行事玄妙莫测，我有时甚至怀疑连他们自己是否清楚自己在做什么。事实上，我至今仍把上人看作佛手中的木偶。他说的话、做的事总能深深打动我们，自己却总是板着一张石头脸，一副就事论事、稀松平常的样子。</w:t>
+        <w:t xml:space="preserve">上人直觉的另一个例子，是他似乎总能以他绝不可能事先计划的方式帮助学生，而且一天到晚都在这样做。比如，在佛殿里打坐几个月之后，不知何故，我对面朝东方这件事变得格外不自在。我没有转过身去，心里却浮现出一首偈子，便写下来递给上人，上面写着：“欲见西方净土阿弥陀，面朝东方如何得见？”几天过去，我把那张字条忘得一干二净，或者想着若会有回复，早就该收到了。但禅师行事玄妙莫测，我有时甚至怀疑，连他们自己都未必清楚自己在做什么。事实上，我至今仍把上人看作佛手中的木偶。他说的话、做的事总能深深打动我们，自己却总是板着一张石头脸，一副就事论事、稀松平常的样子。</w:t>
       </w:r>
     </w:p>
     <w:p>
@@ -5416,7 +5415,7 @@
         <w:rPr>
           <w:rFonts w:ascii="SimSun" w:cs="SimSun" w:eastAsia="SimSun" w:hAnsi="SimSun"/>
         </w:rPr>
-        <w:t xml:space="preserve">直觉现于当下。直觉回应的是它从未预料的因缘，也不会针对同一对象出现第二次。相反，洞见是可以刻意运用并在其上继续构建的知识。洞见拿起一个对象，以常常出人意料的新方式重新审视它。它的步骤可以倒推、可以解释，正如爱因斯坦、牛顿、玛丽·居里等许多人所做过的那样。</w:t>
+        <w:t xml:space="preserve">直觉现于当下。直觉回应的是它从未预料的因缘，也不会针对同一对象出现第二次。相反，洞见是可以刻意运用、并可在此基础上继续发展的知识。洞见拿起一个对象，以常常出人意料的新方式重新审视它。它的步骤可以倒推、可以解释，正如爱因斯坦、牛顿、玛丽·居里等许多人所做过的那样。</w:t>
       </w:r>
     </w:p>
     <w:p>
@@ -5465,55 +5464,55 @@
         <w:rPr>
           <w:rFonts w:ascii="SimSun" w:cs="SimSun" w:eastAsia="SimSun" w:hAnsi="SimSun"/>
         </w:rPr>
-        <w:t xml:space="preserve">佛门有句话说：“他人之事，愚者亦智；自家之事，圣人亦误。”佛教修行要照见心的本性，结果可能让我们觉得自己像一只井底之蛙。我们很容易变得内向封闭，被那些我们宁愿忘掉、冥想却偏偏翻上表面的念头纠缠不休。冥想必然让我们与自己的烦恼、过失和缺点迎面相撞，而这些东西平时我们也许会借着饮酒、娱乐、性、贪婪等种种欲望来逃避——它们正是冥想要削弱的对象。我们可能感到自己陷入了两难：烦恼、欲望和贪婪反倒全被放大了。</w:t>
-      </w:r>
-    </w:p>
-    <w:p>
-      <w:pPr>
-        <w:spacing w:after="120" w:line="340"/>
-        <w:ind w:firstLine="480"/>
-      </w:pPr>
-      <w:r>
-        <w:rPr>
-          <w:rFonts w:ascii="SimSun" w:cs="SimSun" w:eastAsia="SimSun" w:hAnsi="SimSun"/>
-        </w:rPr>
-        <w:t xml:space="preserve">所幸我们并非活在真空之中，而是彼此扶持。佛法修行者尤其如此，他们以正式的誓约相互支持。在佛法的语境中，我们的支持团体就是我们的僧伽（sangha），即与我们分享灵性旅程的人。在更狭窄也更常见的语境里，它指那些定期与我们一起在寺院、家中或其他公共场所冥想的人，通常在某位特定老师的指导之下——我们和同修都视他为自己的灵性导师。</w:t>
-      </w:r>
-    </w:p>
-    <w:p>
-      <w:pPr>
-        <w:spacing w:after="120" w:line="340"/>
-        <w:ind w:firstLine="480"/>
-      </w:pPr>
-      <w:r>
-        <w:rPr>
-          <w:rFonts w:ascii="SimSun" w:cs="SimSun" w:eastAsia="SimSun" w:hAnsi="SimSun"/>
-        </w:rPr>
-        <w:t xml:space="preserve">三昧耶（samaya）是一个梵文词，意为“承诺”，但在这里它指一种特殊的承诺：每位僧伽成员都把自己看作链条中的一环。链条只要一环断裂便告失效；同样，僧伽的存续有赖于每位成员都是可靠的一环。一名成员失守，人人受损；人人尽责，僧伽便能成功。</w:t>
-      </w:r>
-    </w:p>
-    <w:p>
-      <w:pPr>
-        <w:spacing w:after="120" w:line="340"/>
-        <w:ind w:firstLine="480"/>
-      </w:pPr>
-      <w:r>
-        <w:rPr>
-          <w:rFonts w:ascii="SimSun" w:cs="SimSun" w:eastAsia="SimSun" w:hAnsi="SimSun"/>
-        </w:rPr>
-        <w:t xml:space="preserve">灵性之路的本性决定了它不可能独自走完。许多踏上灵性之路的人，此前曾借助匿名戒酒会（Alcoholics Anonymous）或类似的戒毒项目战胜自己的成瘾而受益；同样，遭受过性侵害的人也曾向提供团体治疗的辅导师寻求工作坊的帮助。在我们的社会中，借助以帮助个人重获自尊与自主为宗旨的工作坊、项目和组织，来战胜成瘾或抚平受虐创伤，其益处不胜枚举。</w:t>
-      </w:r>
-    </w:p>
-    <w:p>
-      <w:pPr>
-        <w:spacing w:after="120" w:line="340"/>
-        <w:ind w:firstLine="480"/>
-      </w:pPr>
-      <w:r>
-        <w:rPr>
-          <w:rFonts w:ascii="SimSun" w:cs="SimSun" w:eastAsia="SimSun" w:hAnsi="SimSun"/>
-        </w:rPr>
-        <w:t xml:space="preserve">无论各自的背景如何，作为人，我们都对渴爱、贪婪、愤怒、憎恨、情欲等等上了瘾；由于与生俱来的执取与贪着倾向，即便我们中间最优秀的人，也见不到无云之心的奇妙本性。灵性成熟的瑜伽士或其他成就者可以轻易地独自隐居，因为他已经克服了“结缚”（fetters）；而我们这些寻常人做不到。我们不但需要一位向导或“上师”（guru），还需要志同道合的伴侣一同分享这条道路。</w:t>
+        <w:t xml:space="preserve">佛门有句话说：“他人之事，愚者亦智；自家之事，圣人亦误。”佛教修行要照见心性，结果可能让我们觉得自己像一只井底之蛙。我们很容易变得内向封闭，被那些我们宁愿忘掉、冥想却偏偏翻上表面的念头纠缠不休。冥想必然让我们与自己的烦恼、过失和缺点迎面相撞，而这些东西平时我们也许会借着饮酒、娱乐、性、贪婪等种种欲望来逃避——它们正是冥想要削弱的对象。我们可能感到自己陷入了两难：烦恼、欲望和贪婪反倒全被放大了。</w:t>
+      </w:r>
+    </w:p>
+    <w:p>
+      <w:pPr>
+        <w:spacing w:after="120" w:line="340"/>
+        <w:ind w:firstLine="480"/>
+      </w:pPr>
+      <w:r>
+        <w:rPr>
+          <w:rFonts w:ascii="SimSun" w:cs="SimSun" w:eastAsia="SimSun" w:hAnsi="SimSun"/>
+        </w:rPr>
+        <w:t xml:space="preserve">所幸我们并非活在真空之中，而是彼此扶持。佛法修行者尤其如此，他们以正式的誓约相互支持。在佛法的语境中，我们的支持团体就是我们的僧伽，即与我们分享灵性旅程的人。在更狭窄也更常见的语境里，它指那些定期与我们一起在寺院、家中或其他公共场所冥想的人，通常在某位特定老师的指导之下——我们和同修都视他为自己的灵性导师。</w:t>
+      </w:r>
+    </w:p>
+    <w:p>
+      <w:pPr>
+        <w:spacing w:after="120" w:line="340"/>
+        <w:ind w:firstLine="480"/>
+      </w:pPr>
+      <w:r>
+        <w:rPr>
+          <w:rFonts w:ascii="SimSun" w:cs="SimSun" w:eastAsia="SimSun" w:hAnsi="SimSun"/>
+        </w:rPr>
+        <w:t xml:space="preserve">三昧耶（samaya）是一个梵文词，意为“承诺”，但在这里它指一种特殊的承诺：每位僧伽成员都把自己看作链条中的一环。链条只要一环断裂便告失效；同样，僧伽的存续有赖于每位成员都是可靠的一环。一名成员失职，人人受损；人人尽责，僧伽便能成功。</w:t>
+      </w:r>
+    </w:p>
+    <w:p>
+      <w:pPr>
+        <w:spacing w:after="120" w:line="340"/>
+        <w:ind w:firstLine="480"/>
+      </w:pPr>
+      <w:r>
+        <w:rPr>
+          <w:rFonts w:ascii="SimSun" w:cs="SimSun" w:eastAsia="SimSun" w:hAnsi="SimSun"/>
+        </w:rPr>
+        <w:t xml:space="preserve">灵性之路的本性决定了它不可能独自走完。许多踏上灵性之路的人，此前曾借助匿名戒酒会（Alcoholics Anonymous）或类似的戒毒项目战胜自己的成瘾而受益；同样，遭受过性侵害的人也曾求助于由辅导师带领团体治疗的工作坊。在我们的社会中，借助以帮助个人重获自尊与自主为宗旨的工作坊、项目和组织，来战胜成瘾或抚平受虐创伤，其益处不胜枚举。</w:t>
+      </w:r>
+    </w:p>
+    <w:p>
+      <w:pPr>
+        <w:spacing w:after="120" w:line="340"/>
+        <w:ind w:firstLine="480"/>
+      </w:pPr>
+      <w:r>
+        <w:rPr>
+          <w:rFonts w:ascii="SimSun" w:cs="SimSun" w:eastAsia="SimSun" w:hAnsi="SimSun"/>
+        </w:rPr>
+        <w:t xml:space="preserve">无论各自的背景如何，作为人，我们都对贪爱、贪婪、愤怒、憎恨、情欲等等上了瘾；由于与生俱来的执取与执着倾向，即便我们中间最优秀的人，也见不到无云之心的奇妙本性。灵性成熟的瑜伽士或其他成就者可以轻易地独自隐居，因为他已经克服了“结使”（fetters）；而我们这些寻常人做不到。我们不但需要一位向导或“上师”，还需要志同道合的道友一同分享这条道路。</w:t>
       </w:r>
     </w:p>
     <w:p>
@@ -5537,7 +5536,7 @@
         <w:rPr>
           <w:rFonts w:ascii="SimSun" w:cs="SimSun" w:eastAsia="SimSun" w:hAnsi="SimSun"/>
         </w:rPr>
-        <w:t xml:space="preserve">有些佛教研习需要解读，我们的冥想体验也一样。我们主观的体验和主观的经文解读，若没有他人的客观印证，便无从确知。缺了这种印证，我们可能掉进一个永远爬不出来的兔子洞。避免这种困境，正是僧伽存在的理由，也是基督与佛陀这样的灵性先驱在其教导中列入建立团体之指示的原因。例如，基督说过：“无论在哪里，有两三个人奉我的名聚会，那里就有我在他们中间。”这并非什么高深的学问，俗话也说：“一人计短，二人计长。”</w:t>
+        <w:t xml:space="preserve">有些佛教研习需要解读，我们的冥想体验也一样。我们主观的体验和主观的经文解读，若没有他人的客观印证，便无从确知。缺了这种印证，我们可能掉进一个永远爬不出来的兔子洞。避免这种困境，正是僧伽存在的理由，也是基督与佛陀这样的灵性先驱在教导中专门就组建团体作出指示的缘故。例如，基督说过：“无论在哪里，有两三个人奉我的名聚会，那里就有我在他们中间。”这并非什么高深的学问，俗话也说：“一人计短，二人计长。”</w:t>
       </w:r>
     </w:p>
     <w:p>
@@ -5561,19 +5560,19 @@
         <w:rPr>
           <w:rFonts w:ascii="SimSun" w:cs="SimSun" w:eastAsia="SimSun" w:hAnsi="SimSun"/>
         </w:rPr>
-        <w:t xml:space="preserve">无论是要战胜成瘾、获得证悟，还是仅仅在世间安身立命，我们都离不开他人——不可否认，试图单打独斗的人要么进展缓慢，要么彻底失败。我们必须聪明地选择与什么人为伍：当我们自己找不到出路时，他们应能给予我们所需的视角；同样，当某位师兄师姐陷在困境里无法自拔时，我们也必须成为那道光。</w:t>
-      </w:r>
-    </w:p>
-    <w:p>
-      <w:pPr>
-        <w:spacing w:after="120" w:line="340"/>
-        <w:ind w:firstLine="480"/>
-      </w:pPr>
-      <w:r>
-        <w:rPr>
-          <w:rFonts w:ascii="SimSun" w:cs="SimSun" w:eastAsia="SimSun" w:hAnsi="SimSun"/>
-        </w:rPr>
-        <w:t xml:space="preserve">此外，我们一直是从重担压身、道友分担的角度来强调觉醒之路的，但成为僧伽一员还有一个同样充分的理由：当粗重的负担得以安顿之后，它关系到寂止与洞见的开展。</w:t>
+        <w:t xml:space="preserve">无论是要战胜成瘾、获得证悟，还是仅仅在世间安身立命，我们都离不开他人——不可否认，试图单打独斗的人要么进展缓慢，要么彻底失败。我们必须聪明地选择与什么人为伍：当我们自己找不到出路时，他们应能给予我们所需的视角；同样，当某位师兄弟或师姐妹陷在困境里无法自拔时，我们也必须成为那道光。</w:t>
+      </w:r>
+    </w:p>
+    <w:p>
+      <w:pPr>
+        <w:spacing w:after="120" w:line="340"/>
+        <w:ind w:firstLine="480"/>
+      </w:pPr>
+      <w:r>
+        <w:rPr>
+          <w:rFonts w:ascii="SimSun" w:cs="SimSun" w:eastAsia="SimSun" w:hAnsi="SimSun"/>
+        </w:rPr>
+        <w:t xml:space="preserve">此外，我们一直是从重担压身、道友分担的角度来强调觉醒之路的，但成为僧伽一员还有一个同样充分的理由，关乎粗重的负担卸下之后寂止与洞见的培育。</w:t>
       </w:r>
     </w:p>
     <w:p>
@@ -5606,7 +5605,7 @@
       </w:pPr>
     </w:p>
     <w:sectPr>
-      <w:footerReference w:type="default" r:id="rId7"/>
+      <w:footerReference w:type="default" r:id="rId6"/>
       <w:pgSz w:w="11906" w:h="16838" w:orient="portrait"/>
       <w:pgMar w:top="1440" w:right="1440" w:bottom="1440" w:left="1440" w:header="708" w:footer="708" w:gutter="0"/>
       <w:pgNumType/>
@@ -5614,10 +5613,6 @@
     </w:sectPr>
   </w:body>
 </w:document>
-</file>
-
-<file path=word/comments.xml><?xml version="1.0" encoding="utf-8"?>
-<w:comments xmlns:cx="http://schemas.microsoft.com/office/drawing/2014/chartex" xmlns:cx1="http://schemas.microsoft.com/office/drawing/2015/9/8/chartex" xmlns:cx2="http://schemas.microsoft.com/office/drawing/2015/10/21/chartex" xmlns:cx3="http://schemas.microsoft.com/office/drawing/2016/5/9/chartex" xmlns:cx4="http://schemas.microsoft.com/office/drawing/2016/5/10/chartex" xmlns:cx5="http://schemas.microsoft.com/office/drawing/2016/5/11/chartex" xmlns:cx6="http://schemas.microsoft.com/office/drawing/2016/5/12/chartex" xmlns:cx7="http://schemas.microsoft.com/office/drawing/2016/5/13/chartex" xmlns:cx8="http://schemas.microsoft.com/office/drawing/2016/5/14/chartex" xmlns:mc="http://schemas.openxmlformats.org/markup-compatibility/2006" xmlns:aink="http://schemas.microsoft.com/office/drawing/2016/ink" xmlns:am3d="http://schemas.microsoft.com/office/drawing/2017/model3d" xmlns:o="urn:schemas-microsoft-com:office:office" xmlns:r="http://schemas.openxmlformats.org/officeDocument/2006/relationships" xmlns:m="http://schemas.openxmlformats.org/officeDocument/2006/math" xmlns:v="urn:schemas-microsoft-com:vml" xmlns:wp14="http://schemas.microsoft.com/office/word/2010/wordprocessingDrawing" xmlns:wp="http://schemas.openxmlformats.org/drawingml/2006/wordprocessingDrawing" xmlns:w10="urn:schemas-microsoft-com:office:word" xmlns:w="http://schemas.openxmlformats.org/wordprocessingml/2006/main" xmlns:w14="http://schemas.microsoft.com/office/word/2010/wordml" xmlns:w15="http://schemas.microsoft.com/office/word/2012/wordml" xmlns:w16cex="http://schemas.microsoft.com/office/word/2018/wordml/cex" xmlns:w16cid="http://schemas.microsoft.com/office/word/2016/wordml/cid" xmlns:w16="http://schemas.microsoft.com/office/word/2018/wordml" xmlns:w16sdtdh="http://schemas.microsoft.com/office/word/2020/wordml/sdtdatahash" xmlns:w16se="http://schemas.microsoft.com/office/word/2015/wordml/symex" xmlns:wpg="http://schemas.microsoft.com/office/word/2010/wordprocessingGroup" xmlns:wpi="http://schemas.microsoft.com/office/word/2010/wordprocessingInk" xmlns:wne="http://schemas.microsoft.com/office/word/2006/wordml" xmlns:wps="http://schemas.microsoft.com/office/word/2010/wordprocessingShape"/>
 </file>
 
 <file path=word/endnotes.xml><?xml version="1.0" encoding="utf-8"?>
@@ -5762,7 +5757,7 @@
           <w:sz w:val="18"/>
           <w:szCs w:val="18"/>
         </w:rPr>
-        <w:t xml:space="preserve">“纯粹型”股票指任何只在研发单一产品的股票。生物科技公司通常属于此类：产品若获得 FDA 批准，股价便一飞冲天；若未获批准，公司便会破产。</w:t>
+        <w:t xml:space="preserve">“纯粹型”股票指公司只有一款在研产品的股票。生物科技公司通常属于此类：产品若获得 FDA 批准，股价便一飞冲天；若未获批准，公司便会破产。</w:t>
       </w:r>
     </w:p>
   </w:footnote>
@@ -5773,7 +5768,7 @@
 <w:numbering xmlns:wpc="http://schemas.microsoft.com/office/word/2010/wordprocessingCanvas" xmlns:mc="http://schemas.openxmlformats.org/markup-compatibility/2006" xmlns:o="urn:schemas-microsoft-com:office:office" xmlns:r="http://schemas.openxmlformats.org/officeDocument/2006/relationships" xmlns:m="http://schemas.openxmlformats.org/officeDocument/2006/math" xmlns:v="urn:schemas-microsoft-com:vml" xmlns:wp14="http://schemas.microsoft.com/office/word/2010/wordprocessingDrawing" xmlns:wp="http://schemas.openxmlformats.org/drawingml/2006/wordprocessingDrawing" xmlns:w10="urn:schemas-microsoft-com:office:word" xmlns:w="http://schemas.openxmlformats.org/wordprocessingml/2006/main" xmlns:w14="http://schemas.microsoft.com/office/word/2010/wordml" xmlns:w15="http://schemas.microsoft.com/office/word/2012/wordml" xmlns:wpg="http://schemas.microsoft.com/office/word/2010/wordprocessingGroup" xmlns:wpi="http://schemas.microsoft.com/office/word/2010/wordprocessingInk" xmlns:wne="http://schemas.microsoft.com/office/word/2006/wordml" xmlns:wps="http://schemas.microsoft.com/office/word/2010/wordprocessingShape" mc:Ignorable="w14 w15 wp14">
   <w:abstractNum w:abstractNumId="1" w15:restartNumberingAfterBreak="0">
     <w:multiLevelType w:val="hybridMultilevel"/>
-    <w:lvl w:ilvl="0" w15:tentative="1">
+    <w:lvl w:ilvl="0" w:tentative="1">
       <w:start w:val="1"/>
       <w:numFmt w:val="bullet"/>
       <w:lvlText w:val="●"/>
@@ -5782,7 +5777,7 @@
         <w:ind w:left="720" w:hanging="360"/>
       </w:pPr>
     </w:lvl>
-    <w:lvl w:ilvl="1" w15:tentative="1">
+    <w:lvl w:ilvl="1" w:tentative="1">
       <w:start w:val="1"/>
       <w:numFmt w:val="bullet"/>
       <w:lvlText w:val="○"/>
@@ -5791,7 +5786,7 @@
         <w:ind w:left="1440" w:hanging="360"/>
       </w:pPr>
     </w:lvl>
-    <w:lvl w:ilvl="2" w15:tentative="1">
+    <w:lvl w:ilvl="2" w:tentative="1">
       <w:start w:val="1"/>
       <w:numFmt w:val="bullet"/>
       <w:lvlText w:val="■"/>
@@ -5800,7 +5795,7 @@
         <w:ind w:left="2160" w:hanging="360"/>
       </w:pPr>
     </w:lvl>
-    <w:lvl w:ilvl="3" w15:tentative="1">
+    <w:lvl w:ilvl="3" w:tentative="1">
       <w:start w:val="1"/>
       <w:numFmt w:val="bullet"/>
       <w:lvlText w:val="●"/>
@@ -5809,7 +5804,7 @@
         <w:ind w:left="2880" w:hanging="360"/>
       </w:pPr>
     </w:lvl>
-    <w:lvl w:ilvl="4" w15:tentative="1">
+    <w:lvl w:ilvl="4" w:tentative="1">
       <w:start w:val="1"/>
       <w:numFmt w:val="bullet"/>
       <w:lvlText w:val="○"/>
@@ -5818,7 +5813,7 @@
         <w:ind w:left="3600" w:hanging="360"/>
       </w:pPr>
     </w:lvl>
-    <w:lvl w:ilvl="5" w15:tentative="1">
+    <w:lvl w:ilvl="5" w:tentative="1">
       <w:start w:val="1"/>
       <w:numFmt w:val="bullet"/>
       <w:lvlText w:val="■"/>
@@ -5827,7 +5822,7 @@
         <w:ind w:left="4320" w:hanging="360"/>
       </w:pPr>
     </w:lvl>
-    <w:lvl w:ilvl="6" w15:tentative="1">
+    <w:lvl w:ilvl="6" w:tentative="1">
       <w:start w:val="1"/>
       <w:numFmt w:val="bullet"/>
       <w:lvlText w:val="●"/>
@@ -5836,7 +5831,7 @@
         <w:ind w:left="5040" w:hanging="360"/>
       </w:pPr>
     </w:lvl>
-    <w:lvl w:ilvl="7" w15:tentative="1">
+    <w:lvl w:ilvl="7" w:tentative="1">
       <w:start w:val="1"/>
       <w:numFmt w:val="bullet"/>
       <w:lvlText w:val="●"/>
@@ -5845,7 +5840,7 @@
         <w:ind w:left="5760" w:hanging="360"/>
       </w:pPr>
     </w:lvl>
-    <w:lvl w:ilvl="8" w15:tentative="1">
+    <w:lvl w:ilvl="8" w:tentative="1">
       <w:start w:val="1"/>
       <w:numFmt w:val="bullet"/>
       <w:lvlText w:val="●"/>
@@ -5876,6 +5871,10 @@
     </w:rPrDefault>
     <w:pPrDefault/>
   </w:docDefaults>
+  <w:style w:type="paragraph" w:styleId="Normal" w:default="1">
+    <w:name w:val="Normal"/>
+    <w:qFormat/>
+  </w:style>
   <w:style w:type="paragraph" w:styleId="Title">
     <w:name w:val="Title"/>
     <w:basedOn w:val="Normal"/>
@@ -6054,4 +6053,294 @@
     </w:rPr>
   </w:style>
 </w:styles>
+</file>
+
+<file path=word/theme/theme1.xml><?xml version="1.0" encoding="utf-8"?>
+<a:theme xmlns:a="http://schemas.openxmlformats.org/drawingml/2006/main" name="Office Theme">
+  <a:themeElements>
+    <a:clrScheme name="Office">
+      <a:dk1>
+        <a:sysClr val="windowText" lastClr="000000"/>
+      </a:dk1>
+      <a:lt1>
+        <a:sysClr val="window" lastClr="FFFFFF"/>
+      </a:lt1>
+      <a:dk2>
+        <a:srgbClr val="44546A"/>
+      </a:dk2>
+      <a:lt2>
+        <a:srgbClr val="E7E6E6"/>
+      </a:lt2>
+      <a:accent1>
+        <a:srgbClr val="4472C4"/>
+      </a:accent1>
+      <a:accent2>
+        <a:srgbClr val="ED7D31"/>
+      </a:accent2>
+      <a:accent3>
+        <a:srgbClr val="A5A5A5"/>
+      </a:accent3>
+      <a:accent4>
+        <a:srgbClr val="FFC000"/>
+      </a:accent4>
+      <a:accent5>
+        <a:srgbClr val="5B9BD5"/>
+      </a:accent5>
+      <a:accent6>
+        <a:srgbClr val="70AD47"/>
+      </a:accent6>
+      <a:hlink>
+        <a:srgbClr val="0563C1"/>
+      </a:hlink>
+      <a:folHlink>
+        <a:srgbClr val="954F72"/>
+      </a:folHlink>
+    </a:clrScheme>
+    <a:fontScheme name="Office">
+      <a:majorFont>
+        <a:latin typeface="Calibri Light" panose="020F0302020204030204"/>
+        <a:ea typeface=""/>
+        <a:cs typeface=""/>
+        <a:font script="Jpan" typeface="游ゴシック Light"/>
+        <a:font script="Hang" typeface="맑은 고딕"/>
+        <a:font script="Hans" typeface="等线 Light"/>
+        <a:font script="Hant" typeface="新細明體"/>
+        <a:font script="Arab" typeface="Times New Roman"/>
+        <a:font script="Hebr" typeface="Times New Roman"/>
+        <a:font script="Thai" typeface="Angsana New"/>
+        <a:font script="Ethi" typeface="Nyala"/>
+        <a:font script="Beng" typeface="Vrinda"/>
+        <a:font script="Gujr" typeface="Shruti"/>
+        <a:font script="Khmr" typeface="MoolBoran"/>
+        <a:font script="Knda" typeface="Tunga"/>
+        <a:font script="Guru" typeface="Raavi"/>
+        <a:font script="Cans" typeface="Euphemia"/>
+        <a:font script="Cher" typeface="Plantagenet Cherokee"/>
+        <a:font script="Yiii" typeface="Microsoft Yi Baiti"/>
+        <a:font script="Tibt" typeface="Microsoft Himalaya"/>
+        <a:font script="Thaa" typeface="MV Boli"/>
+        <a:font script="Deva" typeface="Mangal"/>
+        <a:font script="Telu" typeface="Gautami"/>
+        <a:font script="Taml" typeface="Latha"/>
+        <a:font script="Syrc" typeface="Estrangelo Edessa"/>
+        <a:font script="Orya" typeface="Kalinga"/>
+        <a:font script="Mlym" typeface="Kartika"/>
+        <a:font script="Laoo" typeface="DokChampa"/>
+        <a:font script="Sinh" typeface="Iskoola Pota"/>
+        <a:font script="Mong" typeface="Mongolian Baiti"/>
+        <a:font script="Viet" typeface="Times New Roman"/>
+        <a:font script="Uigh" typeface="Microsoft Uighur"/>
+        <a:font script="Geor" typeface="Sylfaen"/>
+        <a:font script="Armn" typeface="Arial"/>
+        <a:font script="Bugi" typeface="Leelawadee UI"/>
+        <a:font script="Bopo" typeface="Microsoft JhengHei"/>
+        <a:font script="Java" typeface="Javanese Text"/>
+        <a:font script="Lisu" typeface="Segoe UI"/>
+        <a:font script="Mymr" typeface="Myanmar Text"/>
+        <a:font script="Nkoo" typeface="Ebrima"/>
+        <a:font script="Olck" typeface="Nirmala UI"/>
+        <a:font script="Osma" typeface="Ebrima"/>
+        <a:font script="Phag" typeface="Phagspa"/>
+        <a:font script="Syrn" typeface="Estrangelo Edessa"/>
+        <a:font script="Syrj" typeface="Estrangelo Edessa"/>
+        <a:font script="Syre" typeface="Estrangelo Edessa"/>
+        <a:font script="Sora" typeface="Nirmala UI"/>
+        <a:font script="Tale" typeface="Microsoft Tai Le"/>
+        <a:font script="Talu" typeface="Microsoft New Tai Lue"/>
+        <a:font script="Tfng" typeface="Ebrima"/>
+      </a:majorFont>
+      <a:minorFont>
+        <a:latin typeface="Calibri" panose="020F0502020204030204"/>
+        <a:ea typeface=""/>
+        <a:cs typeface=""/>
+        <a:font script="Jpan" typeface="游明朝"/>
+        <a:font script="Hang" typeface="맑은 고딕"/>
+        <a:font script="Hans" typeface="等线"/>
+        <a:font script="Hant" typeface="新細明體"/>
+        <a:font script="Arab" typeface="Arial"/>
+        <a:font script="Hebr" typeface="Arial"/>
+        <a:font script="Thai" typeface="Cordia New"/>
+        <a:font script="Ethi" typeface="Nyala"/>
+        <a:font script="Beng" typeface="Vrinda"/>
+        <a:font script="Gujr" typeface="Shruti"/>
+        <a:font script="Khmr" typeface="DaunPenh"/>
+        <a:font script="Knda" typeface="Tunga"/>
+        <a:font script="Guru" typeface="Raavi"/>
+        <a:font script="Cans" typeface="Euphemia"/>
+        <a:font script="Cher" typeface="Plantagenet Cherokee"/>
+        <a:font script="Yiii" typeface="Microsoft Yi Baiti"/>
+        <a:font script="Tibt" typeface="Microsoft Himalaya"/>
+        <a:font script="Thaa" typeface="MV Boli"/>
+        <a:font script="Deva" typeface="Mangal"/>
+        <a:font script="Telu" typeface="Gautami"/>
+        <a:font script="Taml" typeface="Latha"/>
+        <a:font script="Syrc" typeface="Estrangelo Edessa"/>
+        <a:font script="Orya" typeface="Kalinga"/>
+        <a:font script="Mlym" typeface="Kartika"/>
+        <a:font script="Laoo" typeface="DokChampa"/>
+        <a:font script="Sinh" typeface="Iskoola Pota"/>
+        <a:font script="Mong" typeface="Mongolian Baiti"/>
+        <a:font script="Viet" typeface="Arial"/>
+        <a:font script="Uigh" typeface="Microsoft Uighur"/>
+        <a:font script="Geor" typeface="Sylfaen"/>
+        <a:font script="Armn" typeface="Arial"/>
+        <a:font script="Bugi" typeface="Leelawadee UI"/>
+        <a:font script="Bopo" typeface="Microsoft JhengHei"/>
+        <a:font script="Java" typeface="Javanese Text"/>
+        <a:font script="Lisu" typeface="Segoe UI"/>
+        <a:font script="Mymr" typeface="Myanmar Text"/>
+        <a:font script="Nkoo" typeface="Ebrima"/>
+        <a:font script="Olck" typeface="Nirmala UI"/>
+        <a:font script="Osma" typeface="Ebrima"/>
+        <a:font script="Phag" typeface="Phagspa"/>
+        <a:font script="Syrn" typeface="Estrangelo Edessa"/>
+        <a:font script="Syrj" typeface="Estrangelo Edessa"/>
+        <a:font script="Syre" typeface="Estrangelo Edessa"/>
+        <a:font script="Sora" typeface="Nirmala UI"/>
+        <a:font script="Tale" typeface="Microsoft Tai Le"/>
+        <a:font script="Talu" typeface="Microsoft New Tai Lue"/>
+        <a:font script="Tfng" typeface="Ebrima"/>
+      </a:minorFont>
+    </a:fontScheme>
+    <a:fmtScheme name="Office">
+      <a:fillStyleLst>
+        <a:solidFill>
+          <a:schemeClr val="phClr"/>
+        </a:solidFill>
+        <a:gradFill rotWithShape="true">
+          <a:gsLst>
+            <a:gs pos="0">
+              <a:schemeClr val="phClr">
+                <a:lumMod val="110000"/>
+                <a:satMod val="105000"/>
+                <a:tint val="67000"/>
+              </a:schemeClr>
+            </a:gs>
+            <a:gs pos="50000">
+              <a:schemeClr val="phClr">
+                <a:lumMod val="105000"/>
+                <a:satMod val="103000"/>
+                <a:tint val="73000"/>
+              </a:schemeClr>
+            </a:gs>
+            <a:gs pos="100000">
+              <a:schemeClr val="phClr">
+                <a:lumMod val="105000"/>
+                <a:satMod val="109000"/>
+                <a:tint val="81000"/>
+              </a:schemeClr>
+            </a:gs>
+          </a:gsLst>
+          <a:lin ang="5400000" scaled="false"/>
+        </a:gradFill>
+        <a:gradFill rotWithShape="true">
+          <a:gsLst>
+            <a:gs pos="0">
+              <a:schemeClr val="phClr">
+                <a:satMod val="103000"/>
+                <a:lumMod val="102000"/>
+                <a:tint val="94000"/>
+              </a:schemeClr>
+            </a:gs>
+            <a:gs pos="50000">
+              <a:schemeClr val="phClr">
+                <a:satMod val="110000"/>
+                <a:lumMod val="100000"/>
+                <a:shade val="100000"/>
+              </a:schemeClr>
+            </a:gs>
+            <a:gs pos="100000">
+              <a:schemeClr val="phClr">
+                <a:lumMod val="99000"/>
+                <a:satMod val="120000"/>
+                <a:shade val="78000"/>
+              </a:schemeClr>
+            </a:gs>
+          </a:gsLst>
+          <a:lin ang="5400000" scaled="false"/>
+        </a:gradFill>
+      </a:fillStyleLst>
+      <a:lnStyleLst>
+        <a:ln w="6350" cap="flat" cmpd="sng" algn="ctr">
+          <a:solidFill>
+            <a:schemeClr val="phClr"/>
+          </a:solidFill>
+          <a:prstDash val="solid"/>
+          <a:miter lim="800000"/>
+        </a:ln>
+        <a:ln w="12700" cap="flat" cmpd="sng" algn="ctr">
+          <a:solidFill>
+            <a:schemeClr val="phClr"/>
+          </a:solidFill>
+          <a:prstDash val="solid"/>
+          <a:miter lim="800000"/>
+        </a:ln>
+        <a:ln w="19050" cap="flat" cmpd="sng" algn="ctr">
+          <a:solidFill>
+            <a:schemeClr val="phClr"/>
+          </a:solidFill>
+          <a:prstDash val="solid"/>
+          <a:miter lim="800000"/>
+        </a:ln>
+      </a:lnStyleLst>
+      <a:effectStyleLst>
+        <a:effectStyle>
+          <a:effectLst/>
+        </a:effectStyle>
+        <a:effectStyle>
+          <a:effectLst/>
+        </a:effectStyle>
+        <a:effectStyle>
+          <a:effectLst>
+            <a:outerShdw blurRad="57150" dist="19050" dir="5400000" algn="ctr" rotWithShape="false">
+              <a:srgbClr val="000000">
+                <a:alpha val="63000"/>
+              </a:srgbClr>
+            </a:outerShdw>
+          </a:effectLst>
+        </a:effectStyle>
+      </a:effectStyleLst>
+      <a:bgFillStyleLst>
+        <a:solidFill>
+          <a:schemeClr val="phClr"/>
+        </a:solidFill>
+        <a:solidFill>
+          <a:schemeClr val="phClr">
+            <a:tint val="95000"/>
+            <a:satMod val="170000"/>
+          </a:schemeClr>
+        </a:solidFill>
+        <a:gradFill rotWithShape="true">
+          <a:gsLst>
+            <a:gs pos="0">
+              <a:schemeClr val="phClr">
+                <a:tint val="93000"/>
+                <a:satMod val="150000"/>
+                <a:shade val="98000"/>
+                <a:lumMod val="102000"/>
+              </a:schemeClr>
+            </a:gs>
+            <a:gs pos="50000">
+              <a:schemeClr val="phClr">
+                <a:tint val="98000"/>
+                <a:satMod val="130000"/>
+                <a:shade val="90000"/>
+                <a:lumMod val="103000"/>
+              </a:schemeClr>
+            </a:gs>
+            <a:gs pos="100000">
+              <a:schemeClr val="phClr">
+                <a:shade val="63000"/>
+                <a:satMod val="120000"/>
+              </a:schemeClr>
+            </a:gs>
+          </a:gsLst>
+          <a:lin ang="5400000" scaled="false"/>
+        </a:gradFill>
+      </a:bgFillStyleLst>
+    </a:fmtScheme>
+  </a:themeElements>
+  <a:objectDefaults/>
+  <a:extraClrSchemeLst/>
+</a:theme>
 </file>
</xml_diff>